<commit_message>
Added Table and documents related to C7
</commit_message>
<xml_diff>
--- a/C7/C7.docx
+++ b/C7/C7.docx
@@ -66,8 +66,6 @@
               </w:rPr>
               <w:t>Continuous Improvement</w:t>
             </w:r>
-            <w:bookmarkStart w:id="0" w:name="_GoBack"/>
-            <w:bookmarkEnd w:id="0"/>
           </w:p>
         </w:tc>
         <w:tc>
@@ -243,6 +241,70 @@
           <w:lang w:bidi="en-US"/>
         </w:rPr>
       </w:pPr>
+      <w:bookmarkStart w:id="0" w:name="_GoBack"/>
+      <w:r>
+        <w:rPr>
+          <w:rFonts w:ascii="Times New Roman" w:hAnsi="Times New Roman" w:cs="Times New Roman"/>
+          <w:b/>
+          <w:bCs/>
+          <w:spacing w:val="-1"/>
+          <w:sz w:val="24"/>
+          <w:szCs w:val="24"/>
+          <w:lang w:bidi="en-US"/>
+        </w:rPr>
+        <w:t xml:space="preserve">Essence </w:t>
+      </w:r>
+      <w:proofErr w:type="gramStart"/>
+      <w:r>
+        <w:rPr>
+          <w:rFonts w:ascii="Times New Roman" w:hAnsi="Times New Roman" w:cs="Times New Roman"/>
+          <w:b/>
+          <w:bCs/>
+          <w:spacing w:val="-1"/>
+          <w:sz w:val="24"/>
+          <w:szCs w:val="24"/>
+          <w:lang w:bidi="en-US"/>
+        </w:rPr>
+        <w:t>Of</w:t>
+      </w:r>
+      <w:proofErr w:type="gramEnd"/>
+      <w:r>
+        <w:rPr>
+          <w:rFonts w:ascii="Times New Roman" w:hAnsi="Times New Roman" w:cs="Times New Roman"/>
+          <w:b/>
+          <w:bCs/>
+          <w:spacing w:val="-1"/>
+          <w:sz w:val="24"/>
+          <w:szCs w:val="24"/>
+          <w:lang w:bidi="en-US"/>
+        </w:rPr>
+        <w:t xml:space="preserve"> Indian Constitution,</w:t>
+      </w:r>
+      <w:r>
+        <w:rPr>
+          <w:rFonts w:ascii="Times New Roman" w:hAnsi="Times New Roman" w:cs="Times New Roman"/>
+          <w:b/>
+          <w:bCs/>
+          <w:spacing w:val="-1"/>
+          <w:sz w:val="24"/>
+          <w:szCs w:val="24"/>
+          <w:lang w:bidi="en-US"/>
+        </w:rPr>
+        <w:t xml:space="preserve"> </w:t>
+      </w:r>
+      <w:r>
+        <w:rPr>
+          <w:rFonts w:ascii="Times New Roman" w:hAnsi="Times New Roman" w:cs="Times New Roman"/>
+          <w:b/>
+          <w:bCs/>
+          <w:spacing w:val="-1"/>
+          <w:sz w:val="24"/>
+          <w:szCs w:val="24"/>
+          <w:lang w:bidi="en-US"/>
+        </w:rPr>
+        <w:t>Environmental Education And Sustainability</w:t>
+      </w:r>
+      <w:bookmarkEnd w:id="0"/>
     </w:p>
     <w:sectPr>
       <w:pgSz w:w="11906" w:h="16838"/>

</xml_diff>

<commit_message>
Added PO1-3 gap analysis in Report and Sheet
</commit_message>
<xml_diff>
--- a/C7/C7.docx
+++ b/C7/C7.docx
@@ -220,8 +220,1632 @@
           <w:sz w:val="24"/>
           <w:szCs w:val="24"/>
         </w:rPr>
-        <w:t>ndustrial visits and also curriculum Revised to the PO and PSOs. The outcome based curriculum is implemented from the academic year 2019. In plant training of six week after 5th semester is mandatory.</w:t>
+        <w:t>ndustrial visits and also curriculum Revised to the PO and PSOs</w:t>
       </w:r>
+      <w:proofErr w:type="gramStart"/>
+      <w:r>
+        <w:rPr>
+          <w:rFonts w:ascii="Times New Roman" w:hAnsi="Times New Roman" w:cs="Times New Roman"/>
+          <w:sz w:val="24"/>
+          <w:szCs w:val="24"/>
+        </w:rPr>
+        <w:t>..</w:t>
+      </w:r>
+      <w:proofErr w:type="gramEnd"/>
+    </w:p>
+    <w:tbl>
+      <w:tblPr>
+        <w:tblW w:w="0" w:type="auto"/>
+        <w:tblInd w:w="93" w:type="dxa"/>
+        <w:tblLook w:val="04A0" w:firstRow="1" w:lastRow="0" w:firstColumn="1" w:lastColumn="0" w:noHBand="0" w:noVBand="1"/>
+      </w:tblPr>
+      <w:tblGrid>
+        <w:gridCol w:w="721"/>
+        <w:gridCol w:w="1223"/>
+        <w:gridCol w:w="1739"/>
+        <w:gridCol w:w="5466"/>
+      </w:tblGrid>
+      <w:tr>
+        <w:trPr>
+          <w:trHeight w:val="630"/>
+        </w:trPr>
+        <w:tc>
+          <w:tcPr>
+            <w:tcW w:w="0" w:type="auto"/>
+            <w:tcBorders>
+              <w:top w:val="single" w:sz="4" w:space="0" w:color="auto"/>
+              <w:left w:val="single" w:sz="4" w:space="0" w:color="auto"/>
+              <w:bottom w:val="single" w:sz="4" w:space="0" w:color="auto"/>
+              <w:right w:val="single" w:sz="4" w:space="0" w:color="auto"/>
+            </w:tcBorders>
+            <w:shd w:val="clear" w:color="000000" w:fill="FFD966"/>
+            <w:vAlign w:val="center"/>
+            <w:hideMark/>
+          </w:tcPr>
+          <w:p>
+            <w:pPr>
+              <w:spacing w:after="0" w:line="240" w:lineRule="auto"/>
+              <w:jc w:val="center"/>
+              <w:rPr>
+                <w:rFonts w:ascii="Times New Roman" w:eastAsia="Times New Roman" w:hAnsi="Times New Roman" w:cs="Times New Roman"/>
+                <w:b/>
+                <w:bCs/>
+                <w:color w:val="000000"/>
+                <w:sz w:val="24"/>
+                <w:szCs w:val="24"/>
+                <w:lang w:val="en-IN" w:eastAsia="en-IN" w:bidi="mr-IN"/>
+              </w:rPr>
+            </w:pPr>
+            <w:r>
+              <w:rPr>
+                <w:rFonts w:ascii="Times New Roman" w:eastAsia="Times New Roman" w:hAnsi="Times New Roman" w:cs="Times New Roman"/>
+                <w:b/>
+                <w:bCs/>
+                <w:color w:val="000000"/>
+                <w:sz w:val="24"/>
+                <w:szCs w:val="24"/>
+                <w:lang w:val="en-IN" w:eastAsia="en-IN" w:bidi="mr-IN"/>
+              </w:rPr>
+              <w:t>POs</w:t>
+            </w:r>
+          </w:p>
+        </w:tc>
+        <w:tc>
+          <w:tcPr>
+            <w:tcW w:w="0" w:type="auto"/>
+            <w:tcBorders>
+              <w:top w:val="single" w:sz="4" w:space="0" w:color="auto"/>
+              <w:left w:val="nil"/>
+              <w:bottom w:val="single" w:sz="4" w:space="0" w:color="auto"/>
+              <w:right w:val="single" w:sz="4" w:space="0" w:color="auto"/>
+            </w:tcBorders>
+            <w:shd w:val="clear" w:color="000000" w:fill="FFD966"/>
+            <w:vAlign w:val="center"/>
+            <w:hideMark/>
+          </w:tcPr>
+          <w:p>
+            <w:pPr>
+              <w:spacing w:after="0" w:line="240" w:lineRule="auto"/>
+              <w:jc w:val="center"/>
+              <w:rPr>
+                <w:rFonts w:ascii="Times New Roman" w:eastAsia="Times New Roman" w:hAnsi="Times New Roman" w:cs="Times New Roman"/>
+                <w:b/>
+                <w:bCs/>
+                <w:color w:val="000000"/>
+                <w:sz w:val="24"/>
+                <w:szCs w:val="24"/>
+                <w:lang w:val="en-IN" w:eastAsia="en-IN" w:bidi="mr-IN"/>
+              </w:rPr>
+            </w:pPr>
+            <w:r>
+              <w:rPr>
+                <w:rFonts w:ascii="Times New Roman" w:eastAsia="Times New Roman" w:hAnsi="Times New Roman" w:cs="Times New Roman"/>
+                <w:b/>
+                <w:bCs/>
+                <w:color w:val="000000"/>
+                <w:sz w:val="24"/>
+                <w:szCs w:val="24"/>
+                <w:lang w:val="en-IN" w:eastAsia="en-IN" w:bidi="mr-IN"/>
+              </w:rPr>
+              <w:t>Target Level</w:t>
+            </w:r>
+          </w:p>
+        </w:tc>
+        <w:tc>
+          <w:tcPr>
+            <w:tcW w:w="0" w:type="auto"/>
+            <w:tcBorders>
+              <w:top w:val="single" w:sz="4" w:space="0" w:color="auto"/>
+              <w:left w:val="nil"/>
+              <w:bottom w:val="single" w:sz="4" w:space="0" w:color="auto"/>
+              <w:right w:val="single" w:sz="4" w:space="0" w:color="auto"/>
+            </w:tcBorders>
+            <w:shd w:val="clear" w:color="000000" w:fill="FFD966"/>
+            <w:vAlign w:val="center"/>
+            <w:hideMark/>
+          </w:tcPr>
+          <w:p>
+            <w:pPr>
+              <w:spacing w:after="0" w:line="240" w:lineRule="auto"/>
+              <w:jc w:val="center"/>
+              <w:rPr>
+                <w:rFonts w:ascii="Times New Roman" w:eastAsia="Times New Roman" w:hAnsi="Times New Roman" w:cs="Times New Roman"/>
+                <w:b/>
+                <w:bCs/>
+                <w:color w:val="000000"/>
+                <w:sz w:val="24"/>
+                <w:szCs w:val="24"/>
+                <w:lang w:val="en-IN" w:eastAsia="en-IN" w:bidi="mr-IN"/>
+              </w:rPr>
+            </w:pPr>
+            <w:r>
+              <w:rPr>
+                <w:rFonts w:ascii="Times New Roman" w:eastAsia="Times New Roman" w:hAnsi="Times New Roman" w:cs="Times New Roman"/>
+                <w:b/>
+                <w:bCs/>
+                <w:color w:val="000000"/>
+                <w:sz w:val="24"/>
+                <w:szCs w:val="24"/>
+                <w:lang w:val="en-IN" w:eastAsia="en-IN" w:bidi="mr-IN"/>
+              </w:rPr>
+              <w:t>Attainment Level</w:t>
+            </w:r>
+          </w:p>
+        </w:tc>
+        <w:tc>
+          <w:tcPr>
+            <w:tcW w:w="0" w:type="auto"/>
+            <w:tcBorders>
+              <w:top w:val="single" w:sz="4" w:space="0" w:color="auto"/>
+              <w:left w:val="nil"/>
+              <w:bottom w:val="single" w:sz="4" w:space="0" w:color="auto"/>
+              <w:right w:val="single" w:sz="4" w:space="0" w:color="auto"/>
+            </w:tcBorders>
+            <w:shd w:val="clear" w:color="000000" w:fill="FFD966"/>
+            <w:vAlign w:val="center"/>
+            <w:hideMark/>
+          </w:tcPr>
+          <w:p>
+            <w:pPr>
+              <w:spacing w:after="0" w:line="240" w:lineRule="auto"/>
+              <w:jc w:val="center"/>
+              <w:rPr>
+                <w:rFonts w:ascii="Times New Roman" w:eastAsia="Times New Roman" w:hAnsi="Times New Roman" w:cs="Times New Roman"/>
+                <w:b/>
+                <w:bCs/>
+                <w:color w:val="000000"/>
+                <w:sz w:val="24"/>
+                <w:szCs w:val="24"/>
+                <w:lang w:val="en-IN" w:eastAsia="en-IN" w:bidi="mr-IN"/>
+              </w:rPr>
+            </w:pPr>
+            <w:r>
+              <w:rPr>
+                <w:rFonts w:ascii="Times New Roman" w:eastAsia="Times New Roman" w:hAnsi="Times New Roman" w:cs="Times New Roman"/>
+                <w:b/>
+                <w:bCs/>
+                <w:color w:val="000000"/>
+                <w:sz w:val="24"/>
+                <w:szCs w:val="24"/>
+                <w:lang w:val="en-IN" w:eastAsia="en-IN" w:bidi="mr-IN"/>
+              </w:rPr>
+              <w:t>Observations</w:t>
+            </w:r>
+          </w:p>
+        </w:tc>
+      </w:tr>
+      <w:tr>
+        <w:trPr>
+          <w:trHeight w:val="1095"/>
+        </w:trPr>
+        <w:tc>
+          <w:tcPr>
+            <w:tcW w:w="0" w:type="auto"/>
+            <w:gridSpan w:val="4"/>
+            <w:tcBorders>
+              <w:top w:val="single" w:sz="4" w:space="0" w:color="auto"/>
+              <w:left w:val="single" w:sz="4" w:space="0" w:color="auto"/>
+              <w:bottom w:val="single" w:sz="4" w:space="0" w:color="auto"/>
+              <w:right w:val="single" w:sz="4" w:space="0" w:color="auto"/>
+            </w:tcBorders>
+            <w:shd w:val="clear" w:color="000000" w:fill="C6E0B4"/>
+            <w:vAlign w:val="center"/>
+            <w:hideMark/>
+          </w:tcPr>
+          <w:p>
+            <w:pPr>
+              <w:spacing w:after="0" w:line="240" w:lineRule="auto"/>
+              <w:rPr>
+                <w:rFonts w:ascii="Times New Roman" w:eastAsia="Times New Roman" w:hAnsi="Times New Roman" w:cs="Times New Roman"/>
+                <w:b/>
+                <w:bCs/>
+                <w:color w:val="000000"/>
+                <w:sz w:val="24"/>
+                <w:szCs w:val="24"/>
+                <w:lang w:val="en-IN" w:eastAsia="en-IN" w:bidi="mr-IN"/>
+              </w:rPr>
+            </w:pPr>
+            <w:r>
+              <w:rPr>
+                <w:rFonts w:ascii="Times New Roman" w:eastAsia="Times New Roman" w:hAnsi="Times New Roman" w:cs="Times New Roman"/>
+                <w:b/>
+                <w:bCs/>
+                <w:color w:val="000000"/>
+                <w:sz w:val="24"/>
+                <w:szCs w:val="24"/>
+                <w:lang w:val="en-IN" w:eastAsia="en-IN" w:bidi="mr-IN"/>
+              </w:rPr>
+              <w:t>PO1: Basic and Discipline specific knowledge</w:t>
+            </w:r>
+            <w:r>
+              <w:rPr>
+                <w:rFonts w:ascii="Times New Roman" w:eastAsia="Times New Roman" w:hAnsi="Times New Roman" w:cs="Times New Roman"/>
+                <w:color w:val="000000"/>
+                <w:sz w:val="24"/>
+                <w:szCs w:val="24"/>
+                <w:lang w:val="en-IN" w:eastAsia="en-IN" w:bidi="mr-IN"/>
+              </w:rPr>
+              <w:t>: Apply knowledge of basic mathematics, science and engineering fundamentals and engineering specialization to solve the engineering problems.</w:t>
+            </w:r>
+          </w:p>
+        </w:tc>
+      </w:tr>
+      <w:tr>
+        <w:trPr>
+          <w:trHeight w:val="630"/>
+        </w:trPr>
+        <w:tc>
+          <w:tcPr>
+            <w:tcW w:w="0" w:type="auto"/>
+            <w:vMerge w:val="restart"/>
+            <w:tcBorders>
+              <w:top w:val="nil"/>
+              <w:left w:val="single" w:sz="4" w:space="0" w:color="auto"/>
+              <w:bottom w:val="single" w:sz="4" w:space="0" w:color="auto"/>
+              <w:right w:val="single" w:sz="4" w:space="0" w:color="auto"/>
+            </w:tcBorders>
+            <w:shd w:val="clear" w:color="auto" w:fill="auto"/>
+            <w:vAlign w:val="center"/>
+            <w:hideMark/>
+          </w:tcPr>
+          <w:p>
+            <w:pPr>
+              <w:spacing w:after="0" w:line="240" w:lineRule="auto"/>
+              <w:jc w:val="center"/>
+              <w:rPr>
+                <w:rFonts w:ascii="Times New Roman" w:eastAsia="Times New Roman" w:hAnsi="Times New Roman" w:cs="Times New Roman"/>
+                <w:b/>
+                <w:bCs/>
+                <w:color w:val="000000"/>
+                <w:sz w:val="24"/>
+                <w:szCs w:val="24"/>
+                <w:lang w:val="en-IN" w:eastAsia="en-IN" w:bidi="mr-IN"/>
+              </w:rPr>
+            </w:pPr>
+            <w:r>
+              <w:rPr>
+                <w:rFonts w:ascii="Times New Roman" w:eastAsia="Times New Roman" w:hAnsi="Times New Roman" w:cs="Times New Roman"/>
+                <w:b/>
+                <w:bCs/>
+                <w:color w:val="000000"/>
+                <w:sz w:val="24"/>
+                <w:szCs w:val="24"/>
+                <w:lang w:val="en-IN" w:eastAsia="en-IN" w:bidi="mr-IN"/>
+              </w:rPr>
+              <w:t>PO1</w:t>
+            </w:r>
+          </w:p>
+        </w:tc>
+        <w:tc>
+          <w:tcPr>
+            <w:tcW w:w="0" w:type="auto"/>
+            <w:vMerge w:val="restart"/>
+            <w:tcBorders>
+              <w:top w:val="nil"/>
+              <w:left w:val="single" w:sz="4" w:space="0" w:color="auto"/>
+              <w:bottom w:val="single" w:sz="4" w:space="0" w:color="auto"/>
+              <w:right w:val="single" w:sz="4" w:space="0" w:color="auto"/>
+            </w:tcBorders>
+            <w:shd w:val="clear" w:color="auto" w:fill="auto"/>
+            <w:vAlign w:val="center"/>
+            <w:hideMark/>
+          </w:tcPr>
+          <w:p>
+            <w:pPr>
+              <w:spacing w:after="0" w:line="240" w:lineRule="auto"/>
+              <w:jc w:val="center"/>
+              <w:rPr>
+                <w:rFonts w:ascii="Times New Roman" w:eastAsia="Times New Roman" w:hAnsi="Times New Roman" w:cs="Times New Roman"/>
+                <w:color w:val="000000"/>
+                <w:sz w:val="24"/>
+                <w:szCs w:val="24"/>
+                <w:lang w:val="en-IN" w:eastAsia="en-IN" w:bidi="mr-IN"/>
+              </w:rPr>
+            </w:pPr>
+            <w:r>
+              <w:rPr>
+                <w:rFonts w:ascii="Times New Roman" w:eastAsia="Times New Roman" w:hAnsi="Times New Roman" w:cs="Times New Roman"/>
+                <w:color w:val="000000"/>
+                <w:sz w:val="24"/>
+                <w:szCs w:val="24"/>
+                <w:lang w:val="en-IN" w:eastAsia="en-IN" w:bidi="mr-IN"/>
+              </w:rPr>
+              <w:t> </w:t>
+            </w:r>
+          </w:p>
+        </w:tc>
+        <w:tc>
+          <w:tcPr>
+            <w:tcW w:w="0" w:type="auto"/>
+            <w:vMerge w:val="restart"/>
+            <w:tcBorders>
+              <w:top w:val="nil"/>
+              <w:left w:val="single" w:sz="4" w:space="0" w:color="auto"/>
+              <w:bottom w:val="single" w:sz="4" w:space="0" w:color="auto"/>
+              <w:right w:val="single" w:sz="4" w:space="0" w:color="auto"/>
+            </w:tcBorders>
+            <w:shd w:val="clear" w:color="auto" w:fill="auto"/>
+            <w:vAlign w:val="center"/>
+            <w:hideMark/>
+          </w:tcPr>
+          <w:p>
+            <w:pPr>
+              <w:spacing w:after="0" w:line="240" w:lineRule="auto"/>
+              <w:jc w:val="center"/>
+              <w:rPr>
+                <w:rFonts w:ascii="Times New Roman" w:eastAsia="Times New Roman" w:hAnsi="Times New Roman" w:cs="Times New Roman"/>
+                <w:color w:val="000000"/>
+                <w:sz w:val="24"/>
+                <w:szCs w:val="24"/>
+                <w:lang w:val="en-IN" w:eastAsia="en-IN" w:bidi="mr-IN"/>
+              </w:rPr>
+            </w:pPr>
+            <w:r>
+              <w:rPr>
+                <w:rFonts w:ascii="Times New Roman" w:eastAsia="Times New Roman" w:hAnsi="Times New Roman" w:cs="Times New Roman"/>
+                <w:color w:val="000000"/>
+                <w:sz w:val="24"/>
+                <w:szCs w:val="24"/>
+                <w:lang w:val="en-IN" w:eastAsia="en-IN" w:bidi="mr-IN"/>
+              </w:rPr>
+              <w:t> </w:t>
+            </w:r>
+          </w:p>
+        </w:tc>
+        <w:tc>
+          <w:tcPr>
+            <w:tcW w:w="0" w:type="auto"/>
+            <w:tcBorders>
+              <w:top w:val="nil"/>
+              <w:left w:val="nil"/>
+              <w:bottom w:val="single" w:sz="4" w:space="0" w:color="auto"/>
+              <w:right w:val="single" w:sz="4" w:space="0" w:color="auto"/>
+            </w:tcBorders>
+            <w:shd w:val="clear" w:color="auto" w:fill="auto"/>
+            <w:vAlign w:val="center"/>
+            <w:hideMark/>
+          </w:tcPr>
+          <w:p>
+            <w:pPr>
+              <w:spacing w:after="0" w:line="240" w:lineRule="auto"/>
+              <w:rPr>
+                <w:rFonts w:ascii="Times New Roman" w:eastAsia="Times New Roman" w:hAnsi="Times New Roman" w:cs="Times New Roman"/>
+                <w:color w:val="000000"/>
+                <w:sz w:val="24"/>
+                <w:szCs w:val="24"/>
+                <w:lang w:val="en-IN" w:eastAsia="en-IN" w:bidi="mr-IN"/>
+              </w:rPr>
+            </w:pPr>
+            <w:r>
+              <w:rPr>
+                <w:rFonts w:ascii="Times New Roman" w:eastAsia="Times New Roman" w:hAnsi="Times New Roman" w:cs="Times New Roman"/>
+                <w:color w:val="000000"/>
+                <w:sz w:val="24"/>
+                <w:szCs w:val="24"/>
+                <w:lang w:val="en-IN" w:eastAsia="en-IN" w:bidi="mr-IN"/>
+              </w:rPr>
+              <w:t xml:space="preserve">1. At entry level the students </w:t>
+            </w:r>
+            <w:r>
+              <w:rPr>
+                <w:rFonts w:ascii="Times New Roman" w:eastAsia="Times New Roman" w:hAnsi="Times New Roman" w:cs="Times New Roman"/>
+                <w:color w:val="000000"/>
+                <w:sz w:val="24"/>
+                <w:szCs w:val="24"/>
+                <w:lang w:val="en-IN" w:eastAsia="en-IN" w:bidi="mr-IN"/>
+              </w:rPr>
+              <w:t>are</w:t>
+            </w:r>
+            <w:r>
+              <w:rPr>
+                <w:rFonts w:ascii="Times New Roman" w:eastAsia="Times New Roman" w:hAnsi="Times New Roman" w:cs="Times New Roman"/>
+                <w:color w:val="000000"/>
+                <w:sz w:val="24"/>
+                <w:szCs w:val="24"/>
+                <w:lang w:val="en-IN" w:eastAsia="en-IN" w:bidi="mr-IN"/>
+              </w:rPr>
+              <w:t xml:space="preserve"> observed weak in basic fundamental subjects.</w:t>
+            </w:r>
+          </w:p>
+        </w:tc>
+      </w:tr>
+      <w:tr>
+        <w:trPr>
+          <w:trHeight w:val="630"/>
+        </w:trPr>
+        <w:tc>
+          <w:tcPr>
+            <w:tcW w:w="0" w:type="auto"/>
+            <w:vMerge/>
+            <w:tcBorders>
+              <w:top w:val="nil"/>
+              <w:left w:val="single" w:sz="4" w:space="0" w:color="auto"/>
+              <w:bottom w:val="single" w:sz="4" w:space="0" w:color="auto"/>
+              <w:right w:val="single" w:sz="4" w:space="0" w:color="auto"/>
+            </w:tcBorders>
+            <w:vAlign w:val="center"/>
+            <w:hideMark/>
+          </w:tcPr>
+          <w:p>
+            <w:pPr>
+              <w:spacing w:after="0" w:line="240" w:lineRule="auto"/>
+              <w:rPr>
+                <w:rFonts w:ascii="Times New Roman" w:eastAsia="Times New Roman" w:hAnsi="Times New Roman" w:cs="Times New Roman"/>
+                <w:b/>
+                <w:bCs/>
+                <w:color w:val="000000"/>
+                <w:sz w:val="24"/>
+                <w:szCs w:val="24"/>
+                <w:lang w:val="en-IN" w:eastAsia="en-IN" w:bidi="mr-IN"/>
+              </w:rPr>
+            </w:pPr>
+          </w:p>
+        </w:tc>
+        <w:tc>
+          <w:tcPr>
+            <w:tcW w:w="0" w:type="auto"/>
+            <w:vMerge/>
+            <w:tcBorders>
+              <w:top w:val="nil"/>
+              <w:left w:val="single" w:sz="4" w:space="0" w:color="auto"/>
+              <w:bottom w:val="single" w:sz="4" w:space="0" w:color="auto"/>
+              <w:right w:val="single" w:sz="4" w:space="0" w:color="auto"/>
+            </w:tcBorders>
+            <w:vAlign w:val="center"/>
+            <w:hideMark/>
+          </w:tcPr>
+          <w:p>
+            <w:pPr>
+              <w:spacing w:after="0" w:line="240" w:lineRule="auto"/>
+              <w:rPr>
+                <w:rFonts w:ascii="Times New Roman" w:eastAsia="Times New Roman" w:hAnsi="Times New Roman" w:cs="Times New Roman"/>
+                <w:color w:val="000000"/>
+                <w:sz w:val="24"/>
+                <w:szCs w:val="24"/>
+                <w:lang w:val="en-IN" w:eastAsia="en-IN" w:bidi="mr-IN"/>
+              </w:rPr>
+            </w:pPr>
+          </w:p>
+        </w:tc>
+        <w:tc>
+          <w:tcPr>
+            <w:tcW w:w="0" w:type="auto"/>
+            <w:vMerge/>
+            <w:tcBorders>
+              <w:top w:val="nil"/>
+              <w:left w:val="single" w:sz="4" w:space="0" w:color="auto"/>
+              <w:bottom w:val="single" w:sz="4" w:space="0" w:color="auto"/>
+              <w:right w:val="single" w:sz="4" w:space="0" w:color="auto"/>
+            </w:tcBorders>
+            <w:vAlign w:val="center"/>
+            <w:hideMark/>
+          </w:tcPr>
+          <w:p>
+            <w:pPr>
+              <w:spacing w:after="0" w:line="240" w:lineRule="auto"/>
+              <w:rPr>
+                <w:rFonts w:ascii="Times New Roman" w:eastAsia="Times New Roman" w:hAnsi="Times New Roman" w:cs="Times New Roman"/>
+                <w:color w:val="000000"/>
+                <w:sz w:val="24"/>
+                <w:szCs w:val="24"/>
+                <w:lang w:val="en-IN" w:eastAsia="en-IN" w:bidi="mr-IN"/>
+              </w:rPr>
+            </w:pPr>
+          </w:p>
+        </w:tc>
+        <w:tc>
+          <w:tcPr>
+            <w:tcW w:w="0" w:type="auto"/>
+            <w:tcBorders>
+              <w:top w:val="nil"/>
+              <w:left w:val="nil"/>
+              <w:bottom w:val="single" w:sz="4" w:space="0" w:color="auto"/>
+              <w:right w:val="single" w:sz="4" w:space="0" w:color="auto"/>
+            </w:tcBorders>
+            <w:shd w:val="clear" w:color="auto" w:fill="auto"/>
+            <w:vAlign w:val="center"/>
+            <w:hideMark/>
+          </w:tcPr>
+          <w:p>
+            <w:pPr>
+              <w:spacing w:after="0" w:line="240" w:lineRule="auto"/>
+              <w:rPr>
+                <w:rFonts w:ascii="Times New Roman" w:eastAsia="Times New Roman" w:hAnsi="Times New Roman" w:cs="Times New Roman"/>
+                <w:color w:val="000000"/>
+                <w:sz w:val="24"/>
+                <w:szCs w:val="24"/>
+                <w:lang w:val="en-IN" w:eastAsia="en-IN" w:bidi="mr-IN"/>
+              </w:rPr>
+            </w:pPr>
+            <w:r>
+              <w:rPr>
+                <w:rFonts w:ascii="Times New Roman" w:eastAsia="Times New Roman" w:hAnsi="Times New Roman" w:cs="Times New Roman"/>
+                <w:color w:val="000000"/>
+                <w:sz w:val="24"/>
+                <w:szCs w:val="24"/>
+                <w:lang w:val="en-IN" w:eastAsia="en-IN" w:bidi="mr-IN"/>
+              </w:rPr>
+              <w:t xml:space="preserve">2. Students </w:t>
+            </w:r>
+            <w:r>
+              <w:rPr>
+                <w:rFonts w:ascii="Times New Roman" w:eastAsia="Times New Roman" w:hAnsi="Times New Roman" w:cs="Times New Roman"/>
+                <w:color w:val="000000"/>
+                <w:sz w:val="24"/>
+                <w:szCs w:val="24"/>
+                <w:lang w:val="en-IN" w:eastAsia="en-IN" w:bidi="mr-IN"/>
+              </w:rPr>
+              <w:t>are</w:t>
+            </w:r>
+            <w:r>
+              <w:rPr>
+                <w:rFonts w:ascii="Times New Roman" w:eastAsia="Times New Roman" w:hAnsi="Times New Roman" w:cs="Times New Roman"/>
+                <w:color w:val="000000"/>
+                <w:sz w:val="24"/>
+                <w:szCs w:val="24"/>
+                <w:lang w:val="en-IN" w:eastAsia="en-IN" w:bidi="mr-IN"/>
+              </w:rPr>
+              <w:t xml:space="preserve"> weak in their soft skills and unable to grasp engineering fundamentals </w:t>
+            </w:r>
+          </w:p>
+        </w:tc>
+      </w:tr>
+      <w:tr>
+        <w:trPr>
+          <w:trHeight w:val="630"/>
+        </w:trPr>
+        <w:tc>
+          <w:tcPr>
+            <w:tcW w:w="0" w:type="auto"/>
+            <w:vMerge/>
+            <w:tcBorders>
+              <w:top w:val="nil"/>
+              <w:left w:val="single" w:sz="4" w:space="0" w:color="auto"/>
+              <w:bottom w:val="single" w:sz="4" w:space="0" w:color="auto"/>
+              <w:right w:val="single" w:sz="4" w:space="0" w:color="auto"/>
+            </w:tcBorders>
+            <w:vAlign w:val="center"/>
+            <w:hideMark/>
+          </w:tcPr>
+          <w:p>
+            <w:pPr>
+              <w:spacing w:after="0" w:line="240" w:lineRule="auto"/>
+              <w:rPr>
+                <w:rFonts w:ascii="Times New Roman" w:eastAsia="Times New Roman" w:hAnsi="Times New Roman" w:cs="Times New Roman"/>
+                <w:b/>
+                <w:bCs/>
+                <w:color w:val="000000"/>
+                <w:sz w:val="24"/>
+                <w:szCs w:val="24"/>
+                <w:lang w:val="en-IN" w:eastAsia="en-IN" w:bidi="mr-IN"/>
+              </w:rPr>
+            </w:pPr>
+          </w:p>
+        </w:tc>
+        <w:tc>
+          <w:tcPr>
+            <w:tcW w:w="0" w:type="auto"/>
+            <w:vMerge/>
+            <w:tcBorders>
+              <w:top w:val="nil"/>
+              <w:left w:val="single" w:sz="4" w:space="0" w:color="auto"/>
+              <w:bottom w:val="single" w:sz="4" w:space="0" w:color="auto"/>
+              <w:right w:val="single" w:sz="4" w:space="0" w:color="auto"/>
+            </w:tcBorders>
+            <w:vAlign w:val="center"/>
+            <w:hideMark/>
+          </w:tcPr>
+          <w:p>
+            <w:pPr>
+              <w:spacing w:after="0" w:line="240" w:lineRule="auto"/>
+              <w:rPr>
+                <w:rFonts w:ascii="Times New Roman" w:eastAsia="Times New Roman" w:hAnsi="Times New Roman" w:cs="Times New Roman"/>
+                <w:color w:val="000000"/>
+                <w:sz w:val="24"/>
+                <w:szCs w:val="24"/>
+                <w:lang w:val="en-IN" w:eastAsia="en-IN" w:bidi="mr-IN"/>
+              </w:rPr>
+            </w:pPr>
+          </w:p>
+        </w:tc>
+        <w:tc>
+          <w:tcPr>
+            <w:tcW w:w="0" w:type="auto"/>
+            <w:vMerge/>
+            <w:tcBorders>
+              <w:top w:val="nil"/>
+              <w:left w:val="single" w:sz="4" w:space="0" w:color="auto"/>
+              <w:bottom w:val="single" w:sz="4" w:space="0" w:color="auto"/>
+              <w:right w:val="single" w:sz="4" w:space="0" w:color="auto"/>
+            </w:tcBorders>
+            <w:vAlign w:val="center"/>
+            <w:hideMark/>
+          </w:tcPr>
+          <w:p>
+            <w:pPr>
+              <w:spacing w:after="0" w:line="240" w:lineRule="auto"/>
+              <w:rPr>
+                <w:rFonts w:ascii="Times New Roman" w:eastAsia="Times New Roman" w:hAnsi="Times New Roman" w:cs="Times New Roman"/>
+                <w:color w:val="000000"/>
+                <w:sz w:val="24"/>
+                <w:szCs w:val="24"/>
+                <w:lang w:val="en-IN" w:eastAsia="en-IN" w:bidi="mr-IN"/>
+              </w:rPr>
+            </w:pPr>
+          </w:p>
+        </w:tc>
+        <w:tc>
+          <w:tcPr>
+            <w:tcW w:w="0" w:type="auto"/>
+            <w:tcBorders>
+              <w:top w:val="nil"/>
+              <w:left w:val="nil"/>
+              <w:bottom w:val="single" w:sz="4" w:space="0" w:color="auto"/>
+              <w:right w:val="single" w:sz="4" w:space="0" w:color="auto"/>
+            </w:tcBorders>
+            <w:shd w:val="clear" w:color="auto" w:fill="auto"/>
+            <w:vAlign w:val="center"/>
+            <w:hideMark/>
+          </w:tcPr>
+          <w:p>
+            <w:pPr>
+              <w:spacing w:after="0" w:line="240" w:lineRule="auto"/>
+              <w:rPr>
+                <w:rFonts w:ascii="Times New Roman" w:eastAsia="Times New Roman" w:hAnsi="Times New Roman" w:cs="Times New Roman"/>
+                <w:color w:val="000000"/>
+                <w:sz w:val="24"/>
+                <w:szCs w:val="24"/>
+                <w:lang w:val="en-IN" w:eastAsia="en-IN" w:bidi="mr-IN"/>
+              </w:rPr>
+            </w:pPr>
+            <w:r>
+              <w:rPr>
+                <w:rFonts w:ascii="Times New Roman" w:eastAsia="Times New Roman" w:hAnsi="Times New Roman" w:cs="Times New Roman"/>
+                <w:color w:val="000000"/>
+                <w:sz w:val="24"/>
+                <w:szCs w:val="24"/>
+                <w:lang w:val="en-IN" w:eastAsia="en-IN" w:bidi="mr-IN"/>
+              </w:rPr>
+              <w:t xml:space="preserve">3. Tutorial sessions </w:t>
+            </w:r>
+            <w:r>
+              <w:rPr>
+                <w:rFonts w:ascii="Times New Roman" w:eastAsia="Times New Roman" w:hAnsi="Times New Roman" w:cs="Times New Roman"/>
+                <w:color w:val="000000"/>
+                <w:sz w:val="24"/>
+                <w:szCs w:val="24"/>
+                <w:lang w:val="en-IN" w:eastAsia="en-IN" w:bidi="mr-IN"/>
+              </w:rPr>
+              <w:t>are</w:t>
+            </w:r>
+            <w:r>
+              <w:rPr>
+                <w:rFonts w:ascii="Times New Roman" w:eastAsia="Times New Roman" w:hAnsi="Times New Roman" w:cs="Times New Roman"/>
+                <w:color w:val="000000"/>
+                <w:sz w:val="24"/>
+                <w:szCs w:val="24"/>
+                <w:lang w:val="en-IN" w:eastAsia="en-IN" w:bidi="mr-IN"/>
+              </w:rPr>
+              <w:t xml:space="preserve"> not adequate looking towards entry level of students. Extra practice / contents </w:t>
+            </w:r>
+            <w:r>
+              <w:rPr>
+                <w:rFonts w:ascii="Times New Roman" w:eastAsia="Times New Roman" w:hAnsi="Times New Roman" w:cs="Times New Roman"/>
+                <w:color w:val="000000"/>
+                <w:sz w:val="24"/>
+                <w:szCs w:val="24"/>
+                <w:lang w:val="en-IN" w:eastAsia="en-IN" w:bidi="mr-IN"/>
+              </w:rPr>
+              <w:t>are</w:t>
+            </w:r>
+            <w:r>
+              <w:rPr>
+                <w:rFonts w:ascii="Times New Roman" w:eastAsia="Times New Roman" w:hAnsi="Times New Roman" w:cs="Times New Roman"/>
+                <w:color w:val="000000"/>
+                <w:sz w:val="24"/>
+                <w:szCs w:val="24"/>
+                <w:lang w:val="en-IN" w:eastAsia="en-IN" w:bidi="mr-IN"/>
+              </w:rPr>
+              <w:t xml:space="preserve"> needed.</w:t>
+            </w:r>
+          </w:p>
+        </w:tc>
+      </w:tr>
+      <w:tr>
+        <w:trPr>
+          <w:trHeight w:val="540"/>
+        </w:trPr>
+        <w:tc>
+          <w:tcPr>
+            <w:tcW w:w="0" w:type="auto"/>
+            <w:gridSpan w:val="4"/>
+            <w:tcBorders>
+              <w:top w:val="single" w:sz="4" w:space="0" w:color="auto"/>
+              <w:left w:val="single" w:sz="4" w:space="0" w:color="auto"/>
+              <w:bottom w:val="single" w:sz="4" w:space="0" w:color="auto"/>
+              <w:right w:val="single" w:sz="4" w:space="0" w:color="auto"/>
+            </w:tcBorders>
+            <w:shd w:val="clear" w:color="auto" w:fill="auto"/>
+            <w:vAlign w:val="center"/>
+            <w:hideMark/>
+          </w:tcPr>
+          <w:p>
+            <w:pPr>
+              <w:spacing w:after="0" w:line="240" w:lineRule="auto"/>
+              <w:rPr>
+                <w:rFonts w:ascii="Times New Roman" w:eastAsia="Times New Roman" w:hAnsi="Times New Roman" w:cs="Times New Roman"/>
+                <w:b/>
+                <w:bCs/>
+                <w:color w:val="000000"/>
+                <w:sz w:val="24"/>
+                <w:szCs w:val="24"/>
+                <w:lang w:val="en-IN" w:eastAsia="en-IN" w:bidi="mr-IN"/>
+              </w:rPr>
+            </w:pPr>
+            <w:r>
+              <w:rPr>
+                <w:rFonts w:ascii="Times New Roman" w:eastAsia="Times New Roman" w:hAnsi="Times New Roman" w:cs="Times New Roman"/>
+                <w:b/>
+                <w:bCs/>
+                <w:color w:val="000000"/>
+                <w:sz w:val="24"/>
+                <w:szCs w:val="24"/>
+                <w:lang w:val="en-IN" w:eastAsia="en-IN" w:bidi="mr-IN"/>
+              </w:rPr>
+              <w:t>Action 1:</w:t>
+            </w:r>
+            <w:r>
+              <w:rPr>
+                <w:rFonts w:ascii="Times New Roman" w:eastAsia="Times New Roman" w:hAnsi="Times New Roman" w:cs="Times New Roman"/>
+                <w:color w:val="000000"/>
+                <w:sz w:val="24"/>
+                <w:szCs w:val="24"/>
+                <w:lang w:val="en-IN" w:eastAsia="en-IN" w:bidi="mr-IN"/>
+              </w:rPr>
+              <w:t xml:space="preserve"> Weak students pertaining to basic discipline knowledge </w:t>
+            </w:r>
+            <w:r>
+              <w:rPr>
+                <w:rFonts w:ascii="Times New Roman" w:eastAsia="Times New Roman" w:hAnsi="Times New Roman" w:cs="Times New Roman"/>
+                <w:color w:val="000000"/>
+                <w:sz w:val="24"/>
+                <w:szCs w:val="24"/>
+                <w:lang w:val="en-IN" w:eastAsia="en-IN" w:bidi="mr-IN"/>
+              </w:rPr>
+              <w:t xml:space="preserve">are </w:t>
+            </w:r>
+            <w:r>
+              <w:rPr>
+                <w:rFonts w:ascii="Times New Roman" w:eastAsia="Times New Roman" w:hAnsi="Times New Roman" w:cs="Times New Roman"/>
+                <w:color w:val="000000"/>
+                <w:sz w:val="24"/>
+                <w:szCs w:val="24"/>
+                <w:lang w:val="en-IN" w:eastAsia="en-IN" w:bidi="mr-IN"/>
+              </w:rPr>
+              <w:t>identified by conducting baseline test for first year students.</w:t>
+            </w:r>
+          </w:p>
+        </w:tc>
+      </w:tr>
+      <w:tr>
+        <w:trPr>
+          <w:trHeight w:val="540"/>
+        </w:trPr>
+        <w:tc>
+          <w:tcPr>
+            <w:tcW w:w="0" w:type="auto"/>
+            <w:gridSpan w:val="4"/>
+            <w:tcBorders>
+              <w:top w:val="single" w:sz="4" w:space="0" w:color="auto"/>
+              <w:left w:val="single" w:sz="4" w:space="0" w:color="auto"/>
+              <w:bottom w:val="single" w:sz="4" w:space="0" w:color="auto"/>
+              <w:right w:val="single" w:sz="4" w:space="0" w:color="auto"/>
+            </w:tcBorders>
+            <w:shd w:val="clear" w:color="auto" w:fill="auto"/>
+            <w:vAlign w:val="center"/>
+            <w:hideMark/>
+          </w:tcPr>
+          <w:p>
+            <w:pPr>
+              <w:spacing w:after="0" w:line="240" w:lineRule="auto"/>
+              <w:rPr>
+                <w:rFonts w:ascii="Times New Roman" w:eastAsia="Times New Roman" w:hAnsi="Times New Roman" w:cs="Times New Roman"/>
+                <w:b/>
+                <w:bCs/>
+                <w:color w:val="000000"/>
+                <w:sz w:val="24"/>
+                <w:szCs w:val="24"/>
+                <w:lang w:val="en-IN" w:eastAsia="en-IN" w:bidi="mr-IN"/>
+              </w:rPr>
+            </w:pPr>
+            <w:r>
+              <w:rPr>
+                <w:rFonts w:ascii="Times New Roman" w:eastAsia="Times New Roman" w:hAnsi="Times New Roman" w:cs="Times New Roman"/>
+                <w:b/>
+                <w:bCs/>
+                <w:color w:val="000000"/>
+                <w:sz w:val="24"/>
+                <w:szCs w:val="24"/>
+                <w:lang w:val="en-IN" w:eastAsia="en-IN" w:bidi="mr-IN"/>
+              </w:rPr>
+              <w:t>Action 2:</w:t>
+            </w:r>
+            <w:r>
+              <w:rPr>
+                <w:rFonts w:ascii="Times New Roman" w:eastAsia="Times New Roman" w:hAnsi="Times New Roman" w:cs="Times New Roman"/>
+                <w:color w:val="000000"/>
+                <w:sz w:val="24"/>
+                <w:szCs w:val="24"/>
+                <w:lang w:val="en-IN" w:eastAsia="en-IN" w:bidi="mr-IN"/>
+              </w:rPr>
+              <w:t xml:space="preserve"> E-contents </w:t>
+            </w:r>
+            <w:r>
+              <w:rPr>
+                <w:rFonts w:ascii="Times New Roman" w:eastAsia="Times New Roman" w:hAnsi="Times New Roman" w:cs="Times New Roman"/>
+                <w:color w:val="000000"/>
+                <w:sz w:val="24"/>
+                <w:szCs w:val="24"/>
+                <w:lang w:val="en-IN" w:eastAsia="en-IN" w:bidi="mr-IN"/>
+              </w:rPr>
+              <w:t xml:space="preserve">are </w:t>
+            </w:r>
+            <w:r>
+              <w:rPr>
+                <w:rFonts w:ascii="Times New Roman" w:eastAsia="Times New Roman" w:hAnsi="Times New Roman" w:cs="Times New Roman"/>
+                <w:color w:val="000000"/>
+                <w:sz w:val="24"/>
+                <w:szCs w:val="24"/>
+                <w:lang w:val="en-IN" w:eastAsia="en-IN" w:bidi="mr-IN"/>
+              </w:rPr>
+              <w:t>made available to students for grasping the concepts easily</w:t>
+            </w:r>
+          </w:p>
+        </w:tc>
+      </w:tr>
+      <w:tr>
+        <w:trPr>
+          <w:trHeight w:val="540"/>
+        </w:trPr>
+        <w:tc>
+          <w:tcPr>
+            <w:tcW w:w="0" w:type="auto"/>
+            <w:gridSpan w:val="4"/>
+            <w:tcBorders>
+              <w:top w:val="single" w:sz="4" w:space="0" w:color="auto"/>
+              <w:left w:val="single" w:sz="4" w:space="0" w:color="auto"/>
+              <w:bottom w:val="single" w:sz="4" w:space="0" w:color="auto"/>
+              <w:right w:val="single" w:sz="4" w:space="0" w:color="auto"/>
+            </w:tcBorders>
+            <w:shd w:val="clear" w:color="auto" w:fill="auto"/>
+            <w:vAlign w:val="center"/>
+            <w:hideMark/>
+          </w:tcPr>
+          <w:p>
+            <w:pPr>
+              <w:spacing w:after="0" w:line="240" w:lineRule="auto"/>
+              <w:rPr>
+                <w:rFonts w:ascii="Times New Roman" w:eastAsia="Times New Roman" w:hAnsi="Times New Roman" w:cs="Times New Roman"/>
+                <w:b/>
+                <w:bCs/>
+                <w:color w:val="000000"/>
+                <w:sz w:val="24"/>
+                <w:szCs w:val="24"/>
+                <w:lang w:val="en-IN" w:eastAsia="en-IN" w:bidi="mr-IN"/>
+              </w:rPr>
+            </w:pPr>
+            <w:r>
+              <w:rPr>
+                <w:rFonts w:ascii="Times New Roman" w:eastAsia="Times New Roman" w:hAnsi="Times New Roman" w:cs="Times New Roman"/>
+                <w:b/>
+                <w:bCs/>
+                <w:color w:val="000000"/>
+                <w:sz w:val="24"/>
+                <w:szCs w:val="24"/>
+                <w:lang w:val="en-IN" w:eastAsia="en-IN" w:bidi="mr-IN"/>
+              </w:rPr>
+              <w:t xml:space="preserve">Action 3: </w:t>
+            </w:r>
+            <w:r>
+              <w:rPr>
+                <w:rFonts w:ascii="Times New Roman" w:eastAsia="Times New Roman" w:hAnsi="Times New Roman" w:cs="Times New Roman"/>
+                <w:color w:val="000000"/>
+                <w:sz w:val="24"/>
+                <w:szCs w:val="24"/>
+                <w:lang w:val="en-IN" w:eastAsia="en-IN" w:bidi="mr-IN"/>
+              </w:rPr>
+              <w:t xml:space="preserve">Bilingual notes/Lab manuals </w:t>
+            </w:r>
+            <w:r>
+              <w:rPr>
+                <w:rFonts w:ascii="Times New Roman" w:eastAsia="Times New Roman" w:hAnsi="Times New Roman" w:cs="Times New Roman"/>
+                <w:color w:val="000000"/>
+                <w:sz w:val="24"/>
+                <w:szCs w:val="24"/>
+                <w:lang w:val="en-IN" w:eastAsia="en-IN" w:bidi="mr-IN"/>
+              </w:rPr>
+              <w:t xml:space="preserve">are </w:t>
+            </w:r>
+            <w:r>
+              <w:rPr>
+                <w:rFonts w:ascii="Times New Roman" w:eastAsia="Times New Roman" w:hAnsi="Times New Roman" w:cs="Times New Roman"/>
+                <w:color w:val="000000"/>
+                <w:sz w:val="24"/>
+                <w:szCs w:val="24"/>
+                <w:lang w:val="en-IN" w:eastAsia="en-IN" w:bidi="mr-IN"/>
+              </w:rPr>
+              <w:t>made available to students on MSBTE website to overcome language barriers.</w:t>
+            </w:r>
+          </w:p>
+        </w:tc>
+      </w:tr>
+    </w:tbl>
+    <w:p>
+      <w:pPr>
+        <w:tabs>
+          <w:tab w:val="left" w:pos="10890"/>
+          <w:tab w:val="left" w:pos="11250"/>
+        </w:tabs>
+        <w:adjustRightInd w:val="0"/>
+        <w:jc w:val="both"/>
+        <w:rPr>
+          <w:rFonts w:ascii="Times New Roman" w:hAnsi="Times New Roman" w:cs="Times New Roman"/>
+          <w:b/>
+          <w:bCs/>
+          <w:spacing w:val="-1"/>
+          <w:sz w:val="24"/>
+          <w:szCs w:val="24"/>
+          <w:lang w:bidi="en-US"/>
+        </w:rPr>
+      </w:pPr>
+    </w:p>
+    <w:tbl>
+      <w:tblPr>
+        <w:tblW w:w="5000" w:type="pct"/>
+        <w:tblLook w:val="04A0" w:firstRow="1" w:lastRow="0" w:firstColumn="1" w:lastColumn="0" w:noHBand="0" w:noVBand="1"/>
+      </w:tblPr>
+      <w:tblGrid>
+        <w:gridCol w:w="1473"/>
+        <w:gridCol w:w="1388"/>
+        <w:gridCol w:w="1889"/>
+        <w:gridCol w:w="4492"/>
+      </w:tblGrid>
+      <w:tr>
+        <w:trPr>
+          <w:trHeight w:val="690"/>
+        </w:trPr>
+        <w:tc>
+          <w:tcPr>
+            <w:tcW w:w="5000" w:type="pct"/>
+            <w:gridSpan w:val="4"/>
+            <w:tcBorders>
+              <w:top w:val="single" w:sz="4" w:space="0" w:color="auto"/>
+              <w:left w:val="single" w:sz="4" w:space="0" w:color="auto"/>
+              <w:bottom w:val="single" w:sz="4" w:space="0" w:color="auto"/>
+              <w:right w:val="single" w:sz="4" w:space="0" w:color="auto"/>
+            </w:tcBorders>
+            <w:shd w:val="clear" w:color="000000" w:fill="C6E0B4"/>
+            <w:vAlign w:val="center"/>
+            <w:hideMark/>
+          </w:tcPr>
+          <w:p>
+            <w:pPr>
+              <w:spacing w:after="0" w:line="240" w:lineRule="auto"/>
+              <w:rPr>
+                <w:rFonts w:ascii="Times New Roman" w:eastAsia="Times New Roman" w:hAnsi="Times New Roman" w:cs="Times New Roman"/>
+                <w:b/>
+                <w:bCs/>
+                <w:color w:val="000000"/>
+                <w:sz w:val="24"/>
+                <w:szCs w:val="24"/>
+                <w:lang w:val="en-IN" w:eastAsia="en-IN" w:bidi="mr-IN"/>
+              </w:rPr>
+            </w:pPr>
+            <w:r>
+              <w:rPr>
+                <w:rFonts w:ascii="Times New Roman" w:eastAsia="Times New Roman" w:hAnsi="Times New Roman" w:cs="Times New Roman"/>
+                <w:b/>
+                <w:bCs/>
+                <w:color w:val="000000"/>
+                <w:sz w:val="24"/>
+                <w:szCs w:val="24"/>
+                <w:lang w:val="en-IN" w:eastAsia="en-IN" w:bidi="mr-IN"/>
+              </w:rPr>
+              <w:t>PO2</w:t>
+            </w:r>
+            <w:r>
+              <w:rPr>
+                <w:rFonts w:ascii="Times New Roman" w:eastAsia="Times New Roman" w:hAnsi="Times New Roman" w:cs="Times New Roman"/>
+                <w:color w:val="000000"/>
+                <w:sz w:val="24"/>
+                <w:szCs w:val="24"/>
+                <w:lang w:val="en-IN" w:eastAsia="en-IN" w:bidi="mr-IN"/>
+              </w:rPr>
+              <w:t>:</w:t>
+            </w:r>
+            <w:r>
+              <w:rPr>
+                <w:rFonts w:ascii="Times New Roman" w:eastAsia="Times New Roman" w:hAnsi="Times New Roman" w:cs="Times New Roman"/>
+                <w:b/>
+                <w:bCs/>
+                <w:color w:val="000000"/>
+                <w:sz w:val="24"/>
+                <w:szCs w:val="24"/>
+                <w:lang w:val="en-IN" w:eastAsia="en-IN" w:bidi="mr-IN"/>
+              </w:rPr>
+              <w:t xml:space="preserve"> Problem Analysis</w:t>
+            </w:r>
+            <w:r>
+              <w:rPr>
+                <w:rFonts w:ascii="Times New Roman" w:eastAsia="Times New Roman" w:hAnsi="Times New Roman" w:cs="Times New Roman"/>
+                <w:color w:val="000000"/>
+                <w:sz w:val="24"/>
+                <w:szCs w:val="24"/>
+                <w:lang w:val="en-IN" w:eastAsia="en-IN" w:bidi="mr-IN"/>
+              </w:rPr>
+              <w:t xml:space="preserve">: Identify and </w:t>
+            </w:r>
+            <w:r>
+              <w:rPr>
+                <w:rFonts w:ascii="Times New Roman" w:eastAsia="Times New Roman" w:hAnsi="Times New Roman" w:cs="Times New Roman"/>
+                <w:color w:val="000000"/>
+                <w:sz w:val="24"/>
+                <w:szCs w:val="24"/>
+                <w:lang w:val="en-IN" w:eastAsia="en-IN" w:bidi="mr-IN"/>
+              </w:rPr>
+              <w:t>analyse</w:t>
+            </w:r>
+            <w:r>
+              <w:rPr>
+                <w:rFonts w:ascii="Times New Roman" w:eastAsia="Times New Roman" w:hAnsi="Times New Roman" w:cs="Times New Roman"/>
+                <w:color w:val="000000"/>
+                <w:sz w:val="24"/>
+                <w:szCs w:val="24"/>
+                <w:lang w:val="en-IN" w:eastAsia="en-IN" w:bidi="mr-IN"/>
+              </w:rPr>
+              <w:t xml:space="preserve"> well-defined engineering problems using codified standard methods.</w:t>
+            </w:r>
+          </w:p>
+        </w:tc>
+      </w:tr>
+      <w:tr>
+        <w:trPr>
+          <w:trHeight w:val="570"/>
+        </w:trPr>
+        <w:tc>
+          <w:tcPr>
+            <w:tcW w:w="797" w:type="pct"/>
+            <w:vMerge w:val="restart"/>
+            <w:tcBorders>
+              <w:top w:val="nil"/>
+              <w:left w:val="single" w:sz="4" w:space="0" w:color="auto"/>
+              <w:bottom w:val="single" w:sz="4" w:space="0" w:color="auto"/>
+              <w:right w:val="single" w:sz="4" w:space="0" w:color="auto"/>
+            </w:tcBorders>
+            <w:shd w:val="clear" w:color="auto" w:fill="FFFFFF" w:themeFill="background1"/>
+            <w:vAlign w:val="center"/>
+            <w:hideMark/>
+          </w:tcPr>
+          <w:p>
+            <w:pPr>
+              <w:spacing w:after="0" w:line="240" w:lineRule="auto"/>
+              <w:jc w:val="center"/>
+              <w:rPr>
+                <w:rFonts w:ascii="Times New Roman" w:eastAsia="Times New Roman" w:hAnsi="Times New Roman" w:cs="Times New Roman"/>
+                <w:b/>
+                <w:bCs/>
+                <w:color w:val="000000"/>
+                <w:sz w:val="24"/>
+                <w:szCs w:val="24"/>
+                <w:lang w:val="en-IN" w:eastAsia="en-IN" w:bidi="mr-IN"/>
+              </w:rPr>
+            </w:pPr>
+            <w:r>
+              <w:rPr>
+                <w:rFonts w:ascii="Times New Roman" w:eastAsia="Times New Roman" w:hAnsi="Times New Roman" w:cs="Times New Roman"/>
+                <w:b/>
+                <w:bCs/>
+                <w:color w:val="000000"/>
+                <w:sz w:val="24"/>
+                <w:szCs w:val="24"/>
+                <w:lang w:val="en-IN" w:eastAsia="en-IN" w:bidi="mr-IN"/>
+              </w:rPr>
+              <w:t>PO2</w:t>
+            </w:r>
+          </w:p>
+        </w:tc>
+        <w:tc>
+          <w:tcPr>
+            <w:tcW w:w="751" w:type="pct"/>
+            <w:vMerge w:val="restart"/>
+            <w:tcBorders>
+              <w:top w:val="nil"/>
+              <w:left w:val="single" w:sz="4" w:space="0" w:color="auto"/>
+              <w:bottom w:val="single" w:sz="4" w:space="0" w:color="auto"/>
+              <w:right w:val="single" w:sz="4" w:space="0" w:color="auto"/>
+            </w:tcBorders>
+            <w:shd w:val="clear" w:color="auto" w:fill="FFFFFF" w:themeFill="background1"/>
+            <w:vAlign w:val="center"/>
+            <w:hideMark/>
+          </w:tcPr>
+          <w:p>
+            <w:pPr>
+              <w:spacing w:after="0" w:line="240" w:lineRule="auto"/>
+              <w:jc w:val="center"/>
+              <w:rPr>
+                <w:rFonts w:ascii="Times New Roman" w:eastAsia="Times New Roman" w:hAnsi="Times New Roman" w:cs="Times New Roman"/>
+                <w:color w:val="000000"/>
+                <w:sz w:val="24"/>
+                <w:szCs w:val="24"/>
+                <w:lang w:val="en-IN" w:eastAsia="en-IN" w:bidi="mr-IN"/>
+              </w:rPr>
+            </w:pPr>
+            <w:r>
+              <w:rPr>
+                <w:rFonts w:ascii="Times New Roman" w:eastAsia="Times New Roman" w:hAnsi="Times New Roman" w:cs="Times New Roman"/>
+                <w:color w:val="000000"/>
+                <w:sz w:val="24"/>
+                <w:szCs w:val="24"/>
+                <w:lang w:val="en-IN" w:eastAsia="en-IN" w:bidi="mr-IN"/>
+              </w:rPr>
+              <w:t> </w:t>
+            </w:r>
+          </w:p>
+        </w:tc>
+        <w:tc>
+          <w:tcPr>
+            <w:tcW w:w="1022" w:type="pct"/>
+            <w:vMerge w:val="restart"/>
+            <w:tcBorders>
+              <w:top w:val="nil"/>
+              <w:left w:val="single" w:sz="4" w:space="0" w:color="auto"/>
+              <w:bottom w:val="single" w:sz="4" w:space="0" w:color="auto"/>
+              <w:right w:val="single" w:sz="4" w:space="0" w:color="auto"/>
+            </w:tcBorders>
+            <w:shd w:val="clear" w:color="auto" w:fill="FFFFFF" w:themeFill="background1"/>
+            <w:vAlign w:val="center"/>
+            <w:hideMark/>
+          </w:tcPr>
+          <w:p>
+            <w:pPr>
+              <w:spacing w:after="0" w:line="240" w:lineRule="auto"/>
+              <w:jc w:val="center"/>
+              <w:rPr>
+                <w:rFonts w:ascii="Times New Roman" w:eastAsia="Times New Roman" w:hAnsi="Times New Roman" w:cs="Times New Roman"/>
+                <w:color w:val="000000"/>
+                <w:sz w:val="24"/>
+                <w:szCs w:val="24"/>
+                <w:lang w:val="en-IN" w:eastAsia="en-IN" w:bidi="mr-IN"/>
+              </w:rPr>
+            </w:pPr>
+            <w:r>
+              <w:rPr>
+                <w:rFonts w:ascii="Times New Roman" w:eastAsia="Times New Roman" w:hAnsi="Times New Roman" w:cs="Times New Roman"/>
+                <w:color w:val="000000"/>
+                <w:sz w:val="24"/>
+                <w:szCs w:val="24"/>
+                <w:lang w:val="en-IN" w:eastAsia="en-IN" w:bidi="mr-IN"/>
+              </w:rPr>
+              <w:t> </w:t>
+            </w:r>
+          </w:p>
+        </w:tc>
+        <w:tc>
+          <w:tcPr>
+            <w:tcW w:w="2430" w:type="pct"/>
+            <w:tcBorders>
+              <w:top w:val="nil"/>
+              <w:left w:val="nil"/>
+              <w:bottom w:val="single" w:sz="4" w:space="0" w:color="auto"/>
+              <w:right w:val="single" w:sz="4" w:space="0" w:color="auto"/>
+            </w:tcBorders>
+            <w:shd w:val="clear" w:color="auto" w:fill="FFFFFF" w:themeFill="background1"/>
+            <w:vAlign w:val="center"/>
+            <w:hideMark/>
+          </w:tcPr>
+          <w:p>
+            <w:pPr>
+              <w:spacing w:after="0" w:line="240" w:lineRule="auto"/>
+              <w:rPr>
+                <w:rFonts w:ascii="Times New Roman" w:eastAsia="Times New Roman" w:hAnsi="Times New Roman" w:cs="Times New Roman"/>
+                <w:color w:val="000000"/>
+                <w:sz w:val="24"/>
+                <w:szCs w:val="24"/>
+                <w:lang w:val="en-IN" w:eastAsia="en-IN" w:bidi="mr-IN"/>
+              </w:rPr>
+            </w:pPr>
+            <w:r>
+              <w:rPr>
+                <w:rFonts w:ascii="Times New Roman" w:eastAsia="Times New Roman" w:hAnsi="Times New Roman" w:cs="Times New Roman"/>
+                <w:color w:val="000000"/>
+                <w:sz w:val="24"/>
+                <w:szCs w:val="24"/>
+                <w:lang w:val="en-IN" w:eastAsia="en-IN" w:bidi="mr-IN"/>
+              </w:rPr>
+              <w:t>1. Due to lack of prerequisite knowledge about the basic subjects.</w:t>
+            </w:r>
+          </w:p>
+        </w:tc>
+      </w:tr>
+      <w:tr>
+        <w:trPr>
+          <w:trHeight w:val="570"/>
+        </w:trPr>
+        <w:tc>
+          <w:tcPr>
+            <w:tcW w:w="797" w:type="pct"/>
+            <w:vMerge/>
+            <w:tcBorders>
+              <w:top w:val="nil"/>
+              <w:left w:val="single" w:sz="4" w:space="0" w:color="auto"/>
+              <w:bottom w:val="single" w:sz="4" w:space="0" w:color="auto"/>
+              <w:right w:val="single" w:sz="4" w:space="0" w:color="auto"/>
+            </w:tcBorders>
+            <w:shd w:val="clear" w:color="auto" w:fill="FFFFFF" w:themeFill="background1"/>
+            <w:vAlign w:val="center"/>
+            <w:hideMark/>
+          </w:tcPr>
+          <w:p>
+            <w:pPr>
+              <w:spacing w:after="0" w:line="240" w:lineRule="auto"/>
+              <w:rPr>
+                <w:rFonts w:ascii="Times New Roman" w:eastAsia="Times New Roman" w:hAnsi="Times New Roman" w:cs="Times New Roman"/>
+                <w:b/>
+                <w:bCs/>
+                <w:color w:val="000000"/>
+                <w:sz w:val="24"/>
+                <w:szCs w:val="24"/>
+                <w:lang w:val="en-IN" w:eastAsia="en-IN" w:bidi="mr-IN"/>
+              </w:rPr>
+            </w:pPr>
+          </w:p>
+        </w:tc>
+        <w:tc>
+          <w:tcPr>
+            <w:tcW w:w="751" w:type="pct"/>
+            <w:vMerge/>
+            <w:tcBorders>
+              <w:top w:val="nil"/>
+              <w:left w:val="single" w:sz="4" w:space="0" w:color="auto"/>
+              <w:bottom w:val="single" w:sz="4" w:space="0" w:color="auto"/>
+              <w:right w:val="single" w:sz="4" w:space="0" w:color="auto"/>
+            </w:tcBorders>
+            <w:shd w:val="clear" w:color="auto" w:fill="FFFFFF" w:themeFill="background1"/>
+            <w:vAlign w:val="center"/>
+            <w:hideMark/>
+          </w:tcPr>
+          <w:p>
+            <w:pPr>
+              <w:spacing w:after="0" w:line="240" w:lineRule="auto"/>
+              <w:rPr>
+                <w:rFonts w:ascii="Times New Roman" w:eastAsia="Times New Roman" w:hAnsi="Times New Roman" w:cs="Times New Roman"/>
+                <w:color w:val="000000"/>
+                <w:sz w:val="24"/>
+                <w:szCs w:val="24"/>
+                <w:lang w:val="en-IN" w:eastAsia="en-IN" w:bidi="mr-IN"/>
+              </w:rPr>
+            </w:pPr>
+          </w:p>
+        </w:tc>
+        <w:tc>
+          <w:tcPr>
+            <w:tcW w:w="1022" w:type="pct"/>
+            <w:vMerge/>
+            <w:tcBorders>
+              <w:top w:val="nil"/>
+              <w:left w:val="single" w:sz="4" w:space="0" w:color="auto"/>
+              <w:bottom w:val="single" w:sz="4" w:space="0" w:color="auto"/>
+              <w:right w:val="single" w:sz="4" w:space="0" w:color="auto"/>
+            </w:tcBorders>
+            <w:shd w:val="clear" w:color="auto" w:fill="FFFFFF" w:themeFill="background1"/>
+            <w:vAlign w:val="center"/>
+            <w:hideMark/>
+          </w:tcPr>
+          <w:p>
+            <w:pPr>
+              <w:spacing w:after="0" w:line="240" w:lineRule="auto"/>
+              <w:rPr>
+                <w:rFonts w:ascii="Times New Roman" w:eastAsia="Times New Roman" w:hAnsi="Times New Roman" w:cs="Times New Roman"/>
+                <w:color w:val="000000"/>
+                <w:sz w:val="24"/>
+                <w:szCs w:val="24"/>
+                <w:lang w:val="en-IN" w:eastAsia="en-IN" w:bidi="mr-IN"/>
+              </w:rPr>
+            </w:pPr>
+          </w:p>
+        </w:tc>
+        <w:tc>
+          <w:tcPr>
+            <w:tcW w:w="2430" w:type="pct"/>
+            <w:tcBorders>
+              <w:top w:val="nil"/>
+              <w:left w:val="nil"/>
+              <w:bottom w:val="single" w:sz="4" w:space="0" w:color="auto"/>
+              <w:right w:val="single" w:sz="4" w:space="0" w:color="auto"/>
+            </w:tcBorders>
+            <w:shd w:val="clear" w:color="auto" w:fill="FFFFFF" w:themeFill="background1"/>
+            <w:vAlign w:val="center"/>
+            <w:hideMark/>
+          </w:tcPr>
+          <w:p>
+            <w:pPr>
+              <w:spacing w:after="0" w:line="240" w:lineRule="auto"/>
+              <w:rPr>
+                <w:rFonts w:ascii="Times New Roman" w:eastAsia="Times New Roman" w:hAnsi="Times New Roman" w:cs="Times New Roman"/>
+                <w:color w:val="000000"/>
+                <w:sz w:val="24"/>
+                <w:szCs w:val="24"/>
+                <w:lang w:val="en-IN" w:eastAsia="en-IN" w:bidi="mr-IN"/>
+              </w:rPr>
+            </w:pPr>
+            <w:r>
+              <w:rPr>
+                <w:rFonts w:ascii="Times New Roman" w:eastAsia="Times New Roman" w:hAnsi="Times New Roman" w:cs="Times New Roman"/>
+                <w:color w:val="000000"/>
+                <w:sz w:val="24"/>
+                <w:szCs w:val="24"/>
+                <w:lang w:val="en-IN" w:eastAsia="en-IN" w:bidi="mr-IN"/>
+              </w:rPr>
+              <w:t xml:space="preserve">2. Students are from rural area, mostly educated in local language medium, weak in understanding. </w:t>
+            </w:r>
+          </w:p>
+        </w:tc>
+      </w:tr>
+      <w:tr>
+        <w:trPr>
+          <w:trHeight w:val="465"/>
+        </w:trPr>
+        <w:tc>
+          <w:tcPr>
+            <w:tcW w:w="797" w:type="pct"/>
+            <w:vMerge/>
+            <w:tcBorders>
+              <w:top w:val="nil"/>
+              <w:left w:val="single" w:sz="4" w:space="0" w:color="auto"/>
+              <w:bottom w:val="single" w:sz="4" w:space="0" w:color="auto"/>
+              <w:right w:val="single" w:sz="4" w:space="0" w:color="auto"/>
+            </w:tcBorders>
+            <w:shd w:val="clear" w:color="auto" w:fill="FFFFFF" w:themeFill="background1"/>
+            <w:vAlign w:val="center"/>
+            <w:hideMark/>
+          </w:tcPr>
+          <w:p>
+            <w:pPr>
+              <w:spacing w:after="0" w:line="240" w:lineRule="auto"/>
+              <w:rPr>
+                <w:rFonts w:ascii="Times New Roman" w:eastAsia="Times New Roman" w:hAnsi="Times New Roman" w:cs="Times New Roman"/>
+                <w:b/>
+                <w:bCs/>
+                <w:color w:val="000000"/>
+                <w:sz w:val="24"/>
+                <w:szCs w:val="24"/>
+                <w:lang w:val="en-IN" w:eastAsia="en-IN" w:bidi="mr-IN"/>
+              </w:rPr>
+            </w:pPr>
+          </w:p>
+        </w:tc>
+        <w:tc>
+          <w:tcPr>
+            <w:tcW w:w="751" w:type="pct"/>
+            <w:vMerge/>
+            <w:tcBorders>
+              <w:top w:val="nil"/>
+              <w:left w:val="single" w:sz="4" w:space="0" w:color="auto"/>
+              <w:bottom w:val="single" w:sz="4" w:space="0" w:color="auto"/>
+              <w:right w:val="single" w:sz="4" w:space="0" w:color="auto"/>
+            </w:tcBorders>
+            <w:shd w:val="clear" w:color="auto" w:fill="FFFFFF" w:themeFill="background1"/>
+            <w:vAlign w:val="center"/>
+            <w:hideMark/>
+          </w:tcPr>
+          <w:p>
+            <w:pPr>
+              <w:spacing w:after="0" w:line="240" w:lineRule="auto"/>
+              <w:rPr>
+                <w:rFonts w:ascii="Times New Roman" w:eastAsia="Times New Roman" w:hAnsi="Times New Roman" w:cs="Times New Roman"/>
+                <w:color w:val="000000"/>
+                <w:sz w:val="24"/>
+                <w:szCs w:val="24"/>
+                <w:lang w:val="en-IN" w:eastAsia="en-IN" w:bidi="mr-IN"/>
+              </w:rPr>
+            </w:pPr>
+          </w:p>
+        </w:tc>
+        <w:tc>
+          <w:tcPr>
+            <w:tcW w:w="1022" w:type="pct"/>
+            <w:vMerge/>
+            <w:tcBorders>
+              <w:top w:val="nil"/>
+              <w:left w:val="single" w:sz="4" w:space="0" w:color="auto"/>
+              <w:bottom w:val="single" w:sz="4" w:space="0" w:color="auto"/>
+              <w:right w:val="single" w:sz="4" w:space="0" w:color="auto"/>
+            </w:tcBorders>
+            <w:shd w:val="clear" w:color="auto" w:fill="FFFFFF" w:themeFill="background1"/>
+            <w:vAlign w:val="center"/>
+            <w:hideMark/>
+          </w:tcPr>
+          <w:p>
+            <w:pPr>
+              <w:spacing w:after="0" w:line="240" w:lineRule="auto"/>
+              <w:rPr>
+                <w:rFonts w:ascii="Times New Roman" w:eastAsia="Times New Roman" w:hAnsi="Times New Roman" w:cs="Times New Roman"/>
+                <w:color w:val="000000"/>
+                <w:sz w:val="24"/>
+                <w:szCs w:val="24"/>
+                <w:lang w:val="en-IN" w:eastAsia="en-IN" w:bidi="mr-IN"/>
+              </w:rPr>
+            </w:pPr>
+          </w:p>
+        </w:tc>
+        <w:tc>
+          <w:tcPr>
+            <w:tcW w:w="2430" w:type="pct"/>
+            <w:tcBorders>
+              <w:top w:val="nil"/>
+              <w:left w:val="nil"/>
+              <w:bottom w:val="single" w:sz="4" w:space="0" w:color="auto"/>
+              <w:right w:val="single" w:sz="4" w:space="0" w:color="auto"/>
+            </w:tcBorders>
+            <w:shd w:val="clear" w:color="auto" w:fill="FFFFFF" w:themeFill="background1"/>
+            <w:vAlign w:val="center"/>
+            <w:hideMark/>
+          </w:tcPr>
+          <w:p>
+            <w:pPr>
+              <w:spacing w:after="0" w:line="240" w:lineRule="auto"/>
+              <w:rPr>
+                <w:rFonts w:ascii="Times New Roman" w:eastAsia="Times New Roman" w:hAnsi="Times New Roman" w:cs="Times New Roman"/>
+                <w:color w:val="000000"/>
+                <w:sz w:val="24"/>
+                <w:szCs w:val="24"/>
+                <w:lang w:val="en-IN" w:eastAsia="en-IN" w:bidi="mr-IN"/>
+              </w:rPr>
+            </w:pPr>
+            <w:r>
+              <w:rPr>
+                <w:rFonts w:ascii="Times New Roman" w:eastAsia="Times New Roman" w:hAnsi="Times New Roman" w:cs="Times New Roman"/>
+                <w:color w:val="000000"/>
+                <w:sz w:val="24"/>
+                <w:szCs w:val="24"/>
+                <w:lang w:val="en-IN" w:eastAsia="en-IN" w:bidi="mr-IN"/>
+              </w:rPr>
+              <w:t>3. Students are weak in handling/operating computer</w:t>
+            </w:r>
+          </w:p>
+        </w:tc>
+      </w:tr>
+      <w:tr>
+        <w:trPr>
+          <w:trHeight w:val="375"/>
+        </w:trPr>
+        <w:tc>
+          <w:tcPr>
+            <w:tcW w:w="5000" w:type="pct"/>
+            <w:gridSpan w:val="4"/>
+            <w:tcBorders>
+              <w:top w:val="single" w:sz="4" w:space="0" w:color="auto"/>
+              <w:left w:val="single" w:sz="4" w:space="0" w:color="auto"/>
+              <w:bottom w:val="single" w:sz="4" w:space="0" w:color="auto"/>
+              <w:right w:val="single" w:sz="4" w:space="0" w:color="auto"/>
+            </w:tcBorders>
+            <w:shd w:val="clear" w:color="auto" w:fill="FFFFFF" w:themeFill="background1"/>
+            <w:vAlign w:val="center"/>
+            <w:hideMark/>
+          </w:tcPr>
+          <w:p>
+            <w:pPr>
+              <w:spacing w:after="0" w:line="240" w:lineRule="auto"/>
+              <w:rPr>
+                <w:rFonts w:ascii="Times New Roman" w:eastAsia="Times New Roman" w:hAnsi="Times New Roman" w:cs="Times New Roman"/>
+                <w:b/>
+                <w:bCs/>
+                <w:color w:val="000000"/>
+                <w:sz w:val="24"/>
+                <w:szCs w:val="24"/>
+                <w:lang w:val="en-IN" w:eastAsia="en-IN" w:bidi="mr-IN"/>
+              </w:rPr>
+            </w:pPr>
+            <w:r>
+              <w:rPr>
+                <w:rFonts w:ascii="Times New Roman" w:eastAsia="Times New Roman" w:hAnsi="Times New Roman" w:cs="Times New Roman"/>
+                <w:b/>
+                <w:bCs/>
+                <w:color w:val="000000"/>
+                <w:sz w:val="24"/>
+                <w:szCs w:val="24"/>
+                <w:lang w:val="en-IN" w:eastAsia="en-IN" w:bidi="mr-IN"/>
+              </w:rPr>
+              <w:t>Action 1:</w:t>
+            </w:r>
+            <w:r>
+              <w:rPr>
+                <w:rFonts w:ascii="Times New Roman" w:eastAsia="Times New Roman" w:hAnsi="Times New Roman" w:cs="Times New Roman"/>
+                <w:color w:val="000000"/>
+                <w:sz w:val="24"/>
+                <w:szCs w:val="24"/>
+                <w:lang w:val="en-IN" w:eastAsia="en-IN" w:bidi="mr-IN"/>
+              </w:rPr>
+              <w:t xml:space="preserve">  Extra lectures are arranged to enhance the basic knowledge as well as handling of computers.</w:t>
+            </w:r>
+          </w:p>
+        </w:tc>
+      </w:tr>
+      <w:tr>
+        <w:trPr>
+          <w:trHeight w:val="375"/>
+        </w:trPr>
+        <w:tc>
+          <w:tcPr>
+            <w:tcW w:w="5000" w:type="pct"/>
+            <w:gridSpan w:val="4"/>
+            <w:tcBorders>
+              <w:top w:val="single" w:sz="4" w:space="0" w:color="auto"/>
+              <w:left w:val="single" w:sz="4" w:space="0" w:color="auto"/>
+              <w:bottom w:val="single" w:sz="4" w:space="0" w:color="auto"/>
+              <w:right w:val="single" w:sz="4" w:space="0" w:color="auto"/>
+            </w:tcBorders>
+            <w:shd w:val="clear" w:color="auto" w:fill="FFFFFF" w:themeFill="background1"/>
+            <w:vAlign w:val="center"/>
+            <w:hideMark/>
+          </w:tcPr>
+          <w:p>
+            <w:pPr>
+              <w:spacing w:after="0" w:line="240" w:lineRule="auto"/>
+              <w:rPr>
+                <w:rFonts w:ascii="Times New Roman" w:eastAsia="Times New Roman" w:hAnsi="Times New Roman" w:cs="Times New Roman"/>
+                <w:b/>
+                <w:bCs/>
+                <w:color w:val="000000"/>
+                <w:sz w:val="24"/>
+                <w:szCs w:val="24"/>
+                <w:lang w:val="en-IN" w:eastAsia="en-IN" w:bidi="mr-IN"/>
+              </w:rPr>
+            </w:pPr>
+            <w:r>
+              <w:rPr>
+                <w:rFonts w:ascii="Times New Roman" w:eastAsia="Times New Roman" w:hAnsi="Times New Roman" w:cs="Times New Roman"/>
+                <w:b/>
+                <w:bCs/>
+                <w:color w:val="000000"/>
+                <w:sz w:val="24"/>
+                <w:szCs w:val="24"/>
+                <w:lang w:val="en-IN" w:eastAsia="en-IN" w:bidi="mr-IN"/>
+              </w:rPr>
+              <w:t>Action 2:</w:t>
+            </w:r>
+            <w:r>
+              <w:rPr>
+                <w:rFonts w:ascii="Times New Roman" w:eastAsia="Times New Roman" w:hAnsi="Times New Roman" w:cs="Times New Roman"/>
+                <w:color w:val="000000"/>
+                <w:sz w:val="24"/>
+                <w:szCs w:val="24"/>
+                <w:lang w:val="en-IN" w:eastAsia="en-IN" w:bidi="mr-IN"/>
+              </w:rPr>
+              <w:t xml:space="preserve"> Tutorial sessions are arranged and assignments were given for more practice.</w:t>
+            </w:r>
+          </w:p>
+        </w:tc>
+      </w:tr>
+    </w:tbl>
+    <w:p>
+      <w:pPr>
+        <w:tabs>
+          <w:tab w:val="left" w:pos="10890"/>
+          <w:tab w:val="left" w:pos="11250"/>
+        </w:tabs>
+        <w:adjustRightInd w:val="0"/>
+        <w:jc w:val="both"/>
+        <w:rPr>
+          <w:rFonts w:ascii="Times New Roman" w:hAnsi="Times New Roman" w:cs="Times New Roman"/>
+          <w:b/>
+          <w:bCs/>
+          <w:spacing w:val="-1"/>
+          <w:sz w:val="24"/>
+          <w:szCs w:val="24"/>
+          <w:lang w:bidi="en-US"/>
+        </w:rPr>
+      </w:pPr>
     </w:p>
     <w:p>
       <w:pPr>
@@ -241,8 +1865,15 @@
           <w:lang w:bidi="en-US"/>
         </w:rPr>
       </w:pPr>
-      <w:bookmarkStart w:id="0" w:name="_GoBack"/>
-      <w:r>
+    </w:p>
+    <w:p>
+      <w:pPr>
+        <w:tabs>
+          <w:tab w:val="left" w:pos="10890"/>
+          <w:tab w:val="left" w:pos="11250"/>
+        </w:tabs>
+        <w:adjustRightInd w:val="0"/>
+        <w:jc w:val="both"/>
         <w:rPr>
           <w:rFonts w:ascii="Times New Roman" w:hAnsi="Times New Roman" w:cs="Times New Roman"/>
           <w:b/>
@@ -252,10 +1883,16 @@
           <w:szCs w:val="24"/>
           <w:lang w:bidi="en-US"/>
         </w:rPr>
-        <w:t xml:space="preserve">Essence </w:t>
-      </w:r>
-      <w:proofErr w:type="gramStart"/>
-      <w:r>
+      </w:pPr>
+    </w:p>
+    <w:p>
+      <w:pPr>
+        <w:tabs>
+          <w:tab w:val="left" w:pos="10890"/>
+          <w:tab w:val="left" w:pos="11250"/>
+        </w:tabs>
+        <w:adjustRightInd w:val="0"/>
+        <w:jc w:val="both"/>
         <w:rPr>
           <w:rFonts w:ascii="Times New Roman" w:hAnsi="Times New Roman" w:cs="Times New Roman"/>
           <w:b/>
@@ -265,10 +1902,563 @@
           <w:szCs w:val="24"/>
           <w:lang w:bidi="en-US"/>
         </w:rPr>
-        <w:t>Of</w:t>
-      </w:r>
-      <w:proofErr w:type="gramEnd"/>
-      <w:r>
+      </w:pPr>
+    </w:p>
+    <w:tbl>
+      <w:tblPr>
+        <w:tblW w:w="5000" w:type="pct"/>
+        <w:tblLook w:val="04A0" w:firstRow="1" w:lastRow="0" w:firstColumn="1" w:lastColumn="0" w:noHBand="0" w:noVBand="1"/>
+      </w:tblPr>
+      <w:tblGrid>
+        <w:gridCol w:w="1473"/>
+        <w:gridCol w:w="1388"/>
+        <w:gridCol w:w="1889"/>
+        <w:gridCol w:w="4492"/>
+      </w:tblGrid>
+      <w:tr>
+        <w:trPr>
+          <w:trHeight w:val="1050"/>
+        </w:trPr>
+        <w:tc>
+          <w:tcPr>
+            <w:tcW w:w="5000" w:type="pct"/>
+            <w:gridSpan w:val="4"/>
+            <w:tcBorders>
+              <w:top w:val="single" w:sz="4" w:space="0" w:color="auto"/>
+              <w:left w:val="single" w:sz="4" w:space="0" w:color="auto"/>
+              <w:bottom w:val="nil"/>
+              <w:right w:val="single" w:sz="4" w:space="0" w:color="auto"/>
+            </w:tcBorders>
+            <w:shd w:val="clear" w:color="000000" w:fill="C6E0B4"/>
+            <w:vAlign w:val="center"/>
+            <w:hideMark/>
+          </w:tcPr>
+          <w:p>
+            <w:pPr>
+              <w:spacing w:after="0" w:line="240" w:lineRule="auto"/>
+              <w:rPr>
+                <w:rFonts w:ascii="Times New Roman" w:eastAsia="Times New Roman" w:hAnsi="Times New Roman" w:cs="Times New Roman"/>
+                <w:b/>
+                <w:bCs/>
+                <w:color w:val="000000"/>
+                <w:sz w:val="24"/>
+                <w:szCs w:val="24"/>
+                <w:lang w:val="en-IN" w:eastAsia="en-IN" w:bidi="mr-IN"/>
+              </w:rPr>
+            </w:pPr>
+            <w:r>
+              <w:rPr>
+                <w:rFonts w:ascii="Times New Roman" w:eastAsia="Times New Roman" w:hAnsi="Times New Roman" w:cs="Times New Roman"/>
+                <w:b/>
+                <w:bCs/>
+                <w:color w:val="000000"/>
+                <w:sz w:val="24"/>
+                <w:szCs w:val="24"/>
+                <w:lang w:val="en-IN" w:eastAsia="en-IN" w:bidi="mr-IN"/>
+              </w:rPr>
+              <w:lastRenderedPageBreak/>
+              <w:t xml:space="preserve">PO3 </w:t>
+            </w:r>
+            <w:r>
+              <w:rPr>
+                <w:rFonts w:ascii="Times New Roman" w:eastAsia="Times New Roman" w:hAnsi="Times New Roman" w:cs="Times New Roman"/>
+                <w:color w:val="000000"/>
+                <w:sz w:val="24"/>
+                <w:szCs w:val="24"/>
+                <w:lang w:val="en-IN" w:eastAsia="en-IN" w:bidi="mr-IN"/>
+              </w:rPr>
+              <w:t>:</w:t>
+            </w:r>
+            <w:r>
+              <w:rPr>
+                <w:rFonts w:ascii="Times New Roman" w:eastAsia="Times New Roman" w:hAnsi="Times New Roman" w:cs="Times New Roman"/>
+                <w:b/>
+                <w:bCs/>
+                <w:color w:val="000000"/>
+                <w:sz w:val="24"/>
+                <w:szCs w:val="24"/>
+                <w:lang w:val="en-IN" w:eastAsia="en-IN" w:bidi="mr-IN"/>
+              </w:rPr>
+              <w:t>Design/ development of solutions</w:t>
+            </w:r>
+            <w:r>
+              <w:rPr>
+                <w:rFonts w:ascii="Times New Roman" w:eastAsia="Times New Roman" w:hAnsi="Times New Roman" w:cs="Times New Roman"/>
+                <w:color w:val="000000"/>
+                <w:sz w:val="24"/>
+                <w:szCs w:val="24"/>
+                <w:lang w:val="en-IN" w:eastAsia="en-IN" w:bidi="mr-IN"/>
+              </w:rPr>
+              <w:t>: Design solutions for well-defined technical problems and assist with the design of systems components or processes to meet specified needs</w:t>
+            </w:r>
+          </w:p>
+        </w:tc>
+      </w:tr>
+      <w:tr>
+        <w:trPr>
+          <w:trHeight w:val="750"/>
+        </w:trPr>
+        <w:tc>
+          <w:tcPr>
+            <w:tcW w:w="797" w:type="pct"/>
+            <w:vMerge w:val="restart"/>
+            <w:tcBorders>
+              <w:top w:val="single" w:sz="4" w:space="0" w:color="auto"/>
+              <w:left w:val="single" w:sz="4" w:space="0" w:color="auto"/>
+              <w:bottom w:val="single" w:sz="4" w:space="0" w:color="auto"/>
+              <w:right w:val="single" w:sz="4" w:space="0" w:color="auto"/>
+            </w:tcBorders>
+            <w:shd w:val="clear" w:color="000000" w:fill="FFFFFF"/>
+            <w:vAlign w:val="center"/>
+            <w:hideMark/>
+          </w:tcPr>
+          <w:p>
+            <w:pPr>
+              <w:spacing w:after="0" w:line="240" w:lineRule="auto"/>
+              <w:jc w:val="center"/>
+              <w:rPr>
+                <w:rFonts w:ascii="Times New Roman" w:eastAsia="Times New Roman" w:hAnsi="Times New Roman" w:cs="Times New Roman"/>
+                <w:b/>
+                <w:bCs/>
+                <w:color w:val="000000"/>
+                <w:sz w:val="24"/>
+                <w:szCs w:val="24"/>
+                <w:lang w:val="en-IN" w:eastAsia="en-IN" w:bidi="mr-IN"/>
+              </w:rPr>
+            </w:pPr>
+            <w:r>
+              <w:rPr>
+                <w:rFonts w:ascii="Times New Roman" w:eastAsia="Times New Roman" w:hAnsi="Times New Roman" w:cs="Times New Roman"/>
+                <w:b/>
+                <w:bCs/>
+                <w:color w:val="000000"/>
+                <w:sz w:val="24"/>
+                <w:szCs w:val="24"/>
+                <w:lang w:val="en-IN" w:eastAsia="en-IN" w:bidi="mr-IN"/>
+              </w:rPr>
+              <w:t>PO3</w:t>
+            </w:r>
+          </w:p>
+        </w:tc>
+        <w:tc>
+          <w:tcPr>
+            <w:tcW w:w="751" w:type="pct"/>
+            <w:vMerge w:val="restart"/>
+            <w:tcBorders>
+              <w:top w:val="single" w:sz="4" w:space="0" w:color="auto"/>
+              <w:left w:val="single" w:sz="4" w:space="0" w:color="auto"/>
+              <w:bottom w:val="single" w:sz="4" w:space="0" w:color="auto"/>
+              <w:right w:val="single" w:sz="4" w:space="0" w:color="auto"/>
+            </w:tcBorders>
+            <w:shd w:val="clear" w:color="000000" w:fill="FFFFFF"/>
+            <w:vAlign w:val="center"/>
+            <w:hideMark/>
+          </w:tcPr>
+          <w:p>
+            <w:pPr>
+              <w:spacing w:after="0" w:line="240" w:lineRule="auto"/>
+              <w:jc w:val="center"/>
+              <w:rPr>
+                <w:rFonts w:ascii="Times New Roman" w:eastAsia="Times New Roman" w:hAnsi="Times New Roman" w:cs="Times New Roman"/>
+                <w:color w:val="000000"/>
+                <w:sz w:val="24"/>
+                <w:szCs w:val="24"/>
+                <w:lang w:val="en-IN" w:eastAsia="en-IN" w:bidi="mr-IN"/>
+              </w:rPr>
+            </w:pPr>
+            <w:r>
+              <w:rPr>
+                <w:rFonts w:ascii="Times New Roman" w:eastAsia="Times New Roman" w:hAnsi="Times New Roman" w:cs="Times New Roman"/>
+                <w:color w:val="000000"/>
+                <w:sz w:val="24"/>
+                <w:szCs w:val="24"/>
+                <w:lang w:val="en-IN" w:eastAsia="en-IN" w:bidi="mr-IN"/>
+              </w:rPr>
+              <w:t> </w:t>
+            </w:r>
+          </w:p>
+        </w:tc>
+        <w:tc>
+          <w:tcPr>
+            <w:tcW w:w="1022" w:type="pct"/>
+            <w:vMerge w:val="restart"/>
+            <w:tcBorders>
+              <w:top w:val="single" w:sz="4" w:space="0" w:color="auto"/>
+              <w:left w:val="single" w:sz="4" w:space="0" w:color="auto"/>
+              <w:bottom w:val="single" w:sz="4" w:space="0" w:color="auto"/>
+              <w:right w:val="single" w:sz="4" w:space="0" w:color="auto"/>
+            </w:tcBorders>
+            <w:shd w:val="clear" w:color="000000" w:fill="FFFFFF"/>
+            <w:vAlign w:val="center"/>
+            <w:hideMark/>
+          </w:tcPr>
+          <w:p>
+            <w:pPr>
+              <w:spacing w:after="0" w:line="240" w:lineRule="auto"/>
+              <w:jc w:val="center"/>
+              <w:rPr>
+                <w:rFonts w:ascii="Times New Roman" w:eastAsia="Times New Roman" w:hAnsi="Times New Roman" w:cs="Times New Roman"/>
+                <w:color w:val="000000"/>
+                <w:sz w:val="24"/>
+                <w:szCs w:val="24"/>
+                <w:lang w:val="en-IN" w:eastAsia="en-IN" w:bidi="mr-IN"/>
+              </w:rPr>
+            </w:pPr>
+            <w:r>
+              <w:rPr>
+                <w:rFonts w:ascii="Times New Roman" w:eastAsia="Times New Roman" w:hAnsi="Times New Roman" w:cs="Times New Roman"/>
+                <w:color w:val="000000"/>
+                <w:sz w:val="24"/>
+                <w:szCs w:val="24"/>
+                <w:lang w:val="en-IN" w:eastAsia="en-IN" w:bidi="mr-IN"/>
+              </w:rPr>
+              <w:t> </w:t>
+            </w:r>
+          </w:p>
+        </w:tc>
+        <w:tc>
+          <w:tcPr>
+            <w:tcW w:w="2430" w:type="pct"/>
+            <w:tcBorders>
+              <w:top w:val="single" w:sz="4" w:space="0" w:color="auto"/>
+              <w:left w:val="nil"/>
+              <w:bottom w:val="single" w:sz="4" w:space="0" w:color="auto"/>
+              <w:right w:val="single" w:sz="4" w:space="0" w:color="auto"/>
+            </w:tcBorders>
+            <w:shd w:val="clear" w:color="000000" w:fill="FFFFFF"/>
+            <w:vAlign w:val="center"/>
+            <w:hideMark/>
+          </w:tcPr>
+          <w:p>
+            <w:pPr>
+              <w:spacing w:after="0" w:line="240" w:lineRule="auto"/>
+              <w:rPr>
+                <w:rFonts w:ascii="Times New Roman" w:eastAsia="Times New Roman" w:hAnsi="Times New Roman" w:cs="Times New Roman"/>
+                <w:color w:val="000000"/>
+                <w:sz w:val="24"/>
+                <w:szCs w:val="24"/>
+                <w:lang w:val="en-IN" w:eastAsia="en-IN" w:bidi="mr-IN"/>
+              </w:rPr>
+            </w:pPr>
+            <w:r>
+              <w:rPr>
+                <w:rFonts w:ascii="Times New Roman" w:eastAsia="Times New Roman" w:hAnsi="Times New Roman" w:cs="Times New Roman"/>
+                <w:color w:val="000000"/>
+                <w:sz w:val="24"/>
+                <w:szCs w:val="24"/>
+                <w:lang w:val="en-IN" w:eastAsia="en-IN" w:bidi="mr-IN"/>
+              </w:rPr>
+              <w:t xml:space="preserve">1. Students struggle to design ER Diagram </w:t>
+            </w:r>
+            <w:proofErr w:type="spellStart"/>
+            <w:r>
+              <w:rPr>
+                <w:rFonts w:ascii="Times New Roman" w:eastAsia="Times New Roman" w:hAnsi="Times New Roman" w:cs="Times New Roman"/>
+                <w:color w:val="000000"/>
+                <w:sz w:val="24"/>
+                <w:szCs w:val="24"/>
+                <w:lang w:val="en-IN" w:eastAsia="en-IN" w:bidi="mr-IN"/>
+              </w:rPr>
+              <w:t>i.e</w:t>
+            </w:r>
+            <w:proofErr w:type="spellEnd"/>
+            <w:r>
+              <w:rPr>
+                <w:rFonts w:ascii="Times New Roman" w:eastAsia="Times New Roman" w:hAnsi="Times New Roman" w:cs="Times New Roman"/>
+                <w:color w:val="000000"/>
+                <w:sz w:val="24"/>
+                <w:szCs w:val="24"/>
+                <w:lang w:val="en-IN" w:eastAsia="en-IN" w:bidi="mr-IN"/>
+              </w:rPr>
+              <w:t xml:space="preserve"> Scheme design rather than just SQL Commands. </w:t>
+            </w:r>
+          </w:p>
+        </w:tc>
+      </w:tr>
+      <w:tr>
+        <w:trPr>
+          <w:trHeight w:val="720"/>
+        </w:trPr>
+        <w:tc>
+          <w:tcPr>
+            <w:tcW w:w="797" w:type="pct"/>
+            <w:vMerge/>
+            <w:tcBorders>
+              <w:top w:val="single" w:sz="4" w:space="0" w:color="auto"/>
+              <w:left w:val="single" w:sz="4" w:space="0" w:color="auto"/>
+              <w:bottom w:val="single" w:sz="4" w:space="0" w:color="auto"/>
+              <w:right w:val="single" w:sz="4" w:space="0" w:color="auto"/>
+            </w:tcBorders>
+            <w:vAlign w:val="center"/>
+            <w:hideMark/>
+          </w:tcPr>
+          <w:p>
+            <w:pPr>
+              <w:spacing w:after="0" w:line="240" w:lineRule="auto"/>
+              <w:rPr>
+                <w:rFonts w:ascii="Times New Roman" w:eastAsia="Times New Roman" w:hAnsi="Times New Roman" w:cs="Times New Roman"/>
+                <w:b/>
+                <w:bCs/>
+                <w:color w:val="000000"/>
+                <w:sz w:val="24"/>
+                <w:szCs w:val="24"/>
+                <w:lang w:val="en-IN" w:eastAsia="en-IN" w:bidi="mr-IN"/>
+              </w:rPr>
+            </w:pPr>
+          </w:p>
+        </w:tc>
+        <w:tc>
+          <w:tcPr>
+            <w:tcW w:w="751" w:type="pct"/>
+            <w:vMerge/>
+            <w:tcBorders>
+              <w:top w:val="single" w:sz="4" w:space="0" w:color="auto"/>
+              <w:left w:val="single" w:sz="4" w:space="0" w:color="auto"/>
+              <w:bottom w:val="single" w:sz="4" w:space="0" w:color="auto"/>
+              <w:right w:val="single" w:sz="4" w:space="0" w:color="auto"/>
+            </w:tcBorders>
+            <w:vAlign w:val="center"/>
+            <w:hideMark/>
+          </w:tcPr>
+          <w:p>
+            <w:pPr>
+              <w:spacing w:after="0" w:line="240" w:lineRule="auto"/>
+              <w:rPr>
+                <w:rFonts w:ascii="Times New Roman" w:eastAsia="Times New Roman" w:hAnsi="Times New Roman" w:cs="Times New Roman"/>
+                <w:color w:val="000000"/>
+                <w:sz w:val="24"/>
+                <w:szCs w:val="24"/>
+                <w:lang w:val="en-IN" w:eastAsia="en-IN" w:bidi="mr-IN"/>
+              </w:rPr>
+            </w:pPr>
+          </w:p>
+        </w:tc>
+        <w:tc>
+          <w:tcPr>
+            <w:tcW w:w="1022" w:type="pct"/>
+            <w:vMerge/>
+            <w:tcBorders>
+              <w:top w:val="single" w:sz="4" w:space="0" w:color="auto"/>
+              <w:left w:val="single" w:sz="4" w:space="0" w:color="auto"/>
+              <w:bottom w:val="single" w:sz="4" w:space="0" w:color="auto"/>
+              <w:right w:val="single" w:sz="4" w:space="0" w:color="auto"/>
+            </w:tcBorders>
+            <w:vAlign w:val="center"/>
+            <w:hideMark/>
+          </w:tcPr>
+          <w:p>
+            <w:pPr>
+              <w:spacing w:after="0" w:line="240" w:lineRule="auto"/>
+              <w:rPr>
+                <w:rFonts w:ascii="Times New Roman" w:eastAsia="Times New Roman" w:hAnsi="Times New Roman" w:cs="Times New Roman"/>
+                <w:color w:val="000000"/>
+                <w:sz w:val="24"/>
+                <w:szCs w:val="24"/>
+                <w:lang w:val="en-IN" w:eastAsia="en-IN" w:bidi="mr-IN"/>
+              </w:rPr>
+            </w:pPr>
+          </w:p>
+        </w:tc>
+        <w:tc>
+          <w:tcPr>
+            <w:tcW w:w="2430" w:type="pct"/>
+            <w:tcBorders>
+              <w:top w:val="nil"/>
+              <w:left w:val="nil"/>
+              <w:bottom w:val="single" w:sz="4" w:space="0" w:color="auto"/>
+              <w:right w:val="single" w:sz="4" w:space="0" w:color="auto"/>
+            </w:tcBorders>
+            <w:shd w:val="clear" w:color="000000" w:fill="FFFFFF"/>
+            <w:vAlign w:val="center"/>
+            <w:hideMark/>
+          </w:tcPr>
+          <w:p>
+            <w:pPr>
+              <w:spacing w:after="0" w:line="240" w:lineRule="auto"/>
+              <w:rPr>
+                <w:rFonts w:ascii="Times New Roman" w:eastAsia="Times New Roman" w:hAnsi="Times New Roman" w:cs="Times New Roman"/>
+                <w:color w:val="000000"/>
+                <w:sz w:val="24"/>
+                <w:szCs w:val="24"/>
+                <w:lang w:val="en-IN" w:eastAsia="en-IN" w:bidi="mr-IN"/>
+              </w:rPr>
+            </w:pPr>
+            <w:r>
+              <w:rPr>
+                <w:rFonts w:ascii="Times New Roman" w:eastAsia="Times New Roman" w:hAnsi="Times New Roman" w:cs="Times New Roman"/>
+                <w:color w:val="000000"/>
+                <w:sz w:val="24"/>
+                <w:szCs w:val="24"/>
+                <w:lang w:val="en-IN" w:eastAsia="en-IN" w:bidi="mr-IN"/>
+              </w:rPr>
+              <w:t>2. Students had theoretical knowledge of topologies but couldn't design a functional small-scale network.</w:t>
+            </w:r>
+          </w:p>
+        </w:tc>
+      </w:tr>
+      <w:tr>
+        <w:trPr>
+          <w:trHeight w:val="660"/>
+        </w:trPr>
+        <w:tc>
+          <w:tcPr>
+            <w:tcW w:w="5000" w:type="pct"/>
+            <w:gridSpan w:val="4"/>
+            <w:tcBorders>
+              <w:top w:val="nil"/>
+              <w:left w:val="single" w:sz="8" w:space="0" w:color="auto"/>
+              <w:bottom w:val="single" w:sz="8" w:space="0" w:color="auto"/>
+              <w:right w:val="single" w:sz="8" w:space="0" w:color="000000"/>
+            </w:tcBorders>
+            <w:shd w:val="clear" w:color="000000" w:fill="F2F2F2"/>
+            <w:vAlign w:val="center"/>
+            <w:hideMark/>
+          </w:tcPr>
+          <w:p>
+            <w:pPr>
+              <w:spacing w:after="0" w:line="240" w:lineRule="auto"/>
+              <w:rPr>
+                <w:rFonts w:ascii="Times New Roman" w:eastAsia="Times New Roman" w:hAnsi="Times New Roman" w:cs="Times New Roman"/>
+                <w:b/>
+                <w:bCs/>
+                <w:color w:val="000000"/>
+                <w:sz w:val="24"/>
+                <w:szCs w:val="24"/>
+                <w:lang w:val="en-IN" w:eastAsia="en-IN" w:bidi="mr-IN"/>
+              </w:rPr>
+            </w:pPr>
+            <w:r>
+              <w:rPr>
+                <w:rFonts w:ascii="Times New Roman" w:eastAsia="Times New Roman" w:hAnsi="Times New Roman" w:cs="Times New Roman"/>
+                <w:b/>
+                <w:bCs/>
+                <w:color w:val="000000"/>
+                <w:sz w:val="24"/>
+                <w:szCs w:val="24"/>
+                <w:lang w:val="en-IN" w:eastAsia="en-IN" w:bidi="mr-IN"/>
+              </w:rPr>
+              <w:t>Action 1:</w:t>
+            </w:r>
+            <w:r>
+              <w:rPr>
+                <w:rFonts w:ascii="Times New Roman" w:eastAsia="Times New Roman" w:hAnsi="Times New Roman" w:cs="Times New Roman"/>
+                <w:color w:val="000000"/>
+                <w:sz w:val="24"/>
+                <w:szCs w:val="24"/>
+                <w:lang w:val="en-IN" w:eastAsia="en-IN" w:bidi="mr-IN"/>
+              </w:rPr>
+              <w:t xml:space="preserve"> Implemented mandatory ER Diagram before </w:t>
+            </w:r>
+            <w:r>
+              <w:rPr>
+                <w:rFonts w:ascii="Times New Roman" w:eastAsia="Times New Roman" w:hAnsi="Times New Roman" w:cs="Times New Roman"/>
+                <w:color w:val="000000"/>
+                <w:sz w:val="24"/>
+                <w:szCs w:val="24"/>
+                <w:lang w:val="en-IN" w:eastAsia="en-IN" w:bidi="mr-IN"/>
+              </w:rPr>
+              <w:t>actually</w:t>
+            </w:r>
+            <w:bookmarkStart w:id="0" w:name="_GoBack"/>
+            <w:bookmarkEnd w:id="0"/>
+            <w:r>
+              <w:rPr>
+                <w:rFonts w:ascii="Times New Roman" w:eastAsia="Times New Roman" w:hAnsi="Times New Roman" w:cs="Times New Roman"/>
+                <w:color w:val="000000"/>
+                <w:sz w:val="24"/>
+                <w:szCs w:val="24"/>
+                <w:lang w:val="en-IN" w:eastAsia="en-IN" w:bidi="mr-IN"/>
+              </w:rPr>
+              <w:t xml:space="preserve"> going to SQL Commands. Students must present their ER Diagram to the instructor for approval.</w:t>
+            </w:r>
+          </w:p>
+        </w:tc>
+      </w:tr>
+      <w:tr>
+        <w:trPr>
+          <w:trHeight w:val="555"/>
+        </w:trPr>
+        <w:tc>
+          <w:tcPr>
+            <w:tcW w:w="5000" w:type="pct"/>
+            <w:gridSpan w:val="4"/>
+            <w:tcBorders>
+              <w:top w:val="single" w:sz="8" w:space="0" w:color="auto"/>
+              <w:left w:val="single" w:sz="8" w:space="0" w:color="auto"/>
+              <w:bottom w:val="single" w:sz="8" w:space="0" w:color="auto"/>
+              <w:right w:val="single" w:sz="8" w:space="0" w:color="000000"/>
+            </w:tcBorders>
+            <w:shd w:val="clear" w:color="000000" w:fill="F2F2F2"/>
+            <w:vAlign w:val="center"/>
+            <w:hideMark/>
+          </w:tcPr>
+          <w:p>
+            <w:pPr>
+              <w:spacing w:after="0" w:line="240" w:lineRule="auto"/>
+              <w:rPr>
+                <w:rFonts w:ascii="Times New Roman" w:eastAsia="Times New Roman" w:hAnsi="Times New Roman" w:cs="Times New Roman"/>
+                <w:b/>
+                <w:bCs/>
+                <w:color w:val="000000"/>
+                <w:sz w:val="24"/>
+                <w:szCs w:val="24"/>
+                <w:lang w:val="en-IN" w:eastAsia="en-IN" w:bidi="mr-IN"/>
+              </w:rPr>
+            </w:pPr>
+            <w:r>
+              <w:rPr>
+                <w:rFonts w:ascii="Times New Roman" w:eastAsia="Times New Roman" w:hAnsi="Times New Roman" w:cs="Times New Roman"/>
+                <w:b/>
+                <w:bCs/>
+                <w:color w:val="000000"/>
+                <w:sz w:val="24"/>
+                <w:szCs w:val="24"/>
+                <w:lang w:val="en-IN" w:eastAsia="en-IN" w:bidi="mr-IN"/>
+              </w:rPr>
+              <w:t>Action 2:</w:t>
+            </w:r>
+            <w:r>
+              <w:rPr>
+                <w:rFonts w:ascii="Times New Roman" w:eastAsia="Times New Roman" w:hAnsi="Times New Roman" w:cs="Times New Roman"/>
+                <w:color w:val="000000"/>
+                <w:sz w:val="24"/>
+                <w:szCs w:val="24"/>
+                <w:lang w:val="en-IN" w:eastAsia="en-IN" w:bidi="mr-IN"/>
+              </w:rPr>
+              <w:t xml:space="preserve"> Students are asked to form group of four and asked to search and </w:t>
+            </w:r>
+            <w:r>
+              <w:rPr>
+                <w:rFonts w:ascii="Times New Roman" w:eastAsia="Times New Roman" w:hAnsi="Times New Roman" w:cs="Times New Roman"/>
+                <w:color w:val="000000"/>
+                <w:sz w:val="24"/>
+                <w:szCs w:val="24"/>
+                <w:lang w:val="en-IN" w:eastAsia="en-IN" w:bidi="mr-IN"/>
+              </w:rPr>
+              <w:t>demonstrate</w:t>
+            </w:r>
+            <w:r>
+              <w:rPr>
+                <w:rFonts w:ascii="Times New Roman" w:eastAsia="Times New Roman" w:hAnsi="Times New Roman" w:cs="Times New Roman"/>
+                <w:color w:val="000000"/>
+                <w:sz w:val="24"/>
+                <w:szCs w:val="24"/>
+                <w:lang w:val="en-IN" w:eastAsia="en-IN" w:bidi="mr-IN"/>
+              </w:rPr>
+              <w:t xml:space="preserve"> animation of actual packet transfer on Internet</w:t>
+            </w:r>
+          </w:p>
+        </w:tc>
+      </w:tr>
+    </w:tbl>
+    <w:p>
+      <w:pPr>
+        <w:tabs>
+          <w:tab w:val="left" w:pos="10890"/>
+          <w:tab w:val="left" w:pos="11250"/>
+        </w:tabs>
+        <w:adjustRightInd w:val="0"/>
+        <w:jc w:val="both"/>
         <w:rPr>
           <w:rFonts w:ascii="Times New Roman" w:hAnsi="Times New Roman" w:cs="Times New Roman"/>
           <w:b/>
@@ -278,33 +2468,7 @@
           <w:szCs w:val="24"/>
           <w:lang w:bidi="en-US"/>
         </w:rPr>
-        <w:t xml:space="preserve"> Indian Constitution,</w:t>
-      </w:r>
-      <w:r>
-        <w:rPr>
-          <w:rFonts w:ascii="Times New Roman" w:hAnsi="Times New Roman" w:cs="Times New Roman"/>
-          <w:b/>
-          <w:bCs/>
-          <w:spacing w:val="-1"/>
-          <w:sz w:val="24"/>
-          <w:szCs w:val="24"/>
-          <w:lang w:bidi="en-US"/>
-        </w:rPr>
-        <w:t xml:space="preserve"> </w:t>
-      </w:r>
-      <w:r>
-        <w:rPr>
-          <w:rFonts w:ascii="Times New Roman" w:hAnsi="Times New Roman" w:cs="Times New Roman"/>
-          <w:b/>
-          <w:bCs/>
-          <w:spacing w:val="-1"/>
-          <w:sz w:val="24"/>
-          <w:szCs w:val="24"/>
-          <w:lang w:bidi="en-US"/>
-        </w:rPr>
-        <w:t>Environmental Education And Sustainability</w:t>
-      </w:r>
-      <w:bookmarkEnd w:id="0"/>
+      </w:pPr>
     </w:p>
     <w:sectPr>
       <w:pgSz w:w="11906" w:h="16838"/>

</xml_diff>

<commit_message>
Made Changes in C6 as per suggetions from Lalbondre Sir
</commit_message>
<xml_diff>
--- a/C7/C7.docx
+++ b/C7/C7.docx
@@ -2359,8 +2359,6 @@
               </w:rPr>
               <w:t>actually</w:t>
             </w:r>
-            <w:bookmarkStart w:id="0" w:name="_GoBack"/>
-            <w:bookmarkEnd w:id="0"/>
             <w:r>
               <w:rPr>
                 <w:rFonts w:ascii="Times New Roman" w:eastAsia="Times New Roman" w:hAnsi="Times New Roman" w:cs="Times New Roman"/>
@@ -2446,6 +2444,512 @@
                 <w:lang w:val="en-IN" w:eastAsia="en-IN" w:bidi="mr-IN"/>
               </w:rPr>
               <w:t xml:space="preserve"> animation of actual packet transfer on Internet</w:t>
+            </w:r>
+          </w:p>
+        </w:tc>
+      </w:tr>
+    </w:tbl>
+    <w:p>
+      <w:pPr>
+        <w:tabs>
+          <w:tab w:val="left" w:pos="10890"/>
+          <w:tab w:val="left" w:pos="11250"/>
+        </w:tabs>
+        <w:adjustRightInd w:val="0"/>
+        <w:jc w:val="both"/>
+        <w:rPr>
+          <w:rFonts w:ascii="Times New Roman" w:hAnsi="Times New Roman" w:cs="Times New Roman"/>
+          <w:b/>
+          <w:bCs/>
+          <w:spacing w:val="-1"/>
+          <w:sz w:val="24"/>
+          <w:szCs w:val="24"/>
+          <w:lang w:bidi="en-US"/>
+        </w:rPr>
+      </w:pPr>
+    </w:p>
+    <w:tbl>
+      <w:tblPr>
+        <w:tblW w:w="5000" w:type="pct"/>
+        <w:tblLook w:val="04A0" w:firstRow="1" w:lastRow="0" w:firstColumn="1" w:lastColumn="0" w:noHBand="0" w:noVBand="1"/>
+      </w:tblPr>
+      <w:tblGrid>
+        <w:gridCol w:w="1264"/>
+        <w:gridCol w:w="1634"/>
+        <w:gridCol w:w="1889"/>
+        <w:gridCol w:w="4455"/>
+      </w:tblGrid>
+      <w:tr>
+        <w:trPr>
+          <w:trHeight w:val="810"/>
+        </w:trPr>
+        <w:tc>
+          <w:tcPr>
+            <w:tcW w:w="5000" w:type="pct"/>
+            <w:gridSpan w:val="4"/>
+            <w:tcBorders>
+              <w:top w:val="single" w:sz="4" w:space="0" w:color="auto"/>
+              <w:left w:val="single" w:sz="4" w:space="0" w:color="auto"/>
+              <w:bottom w:val="nil"/>
+              <w:right w:val="single" w:sz="4" w:space="0" w:color="auto"/>
+            </w:tcBorders>
+            <w:shd w:val="clear" w:color="000000" w:fill="C6E0B4"/>
+            <w:vAlign w:val="center"/>
+            <w:hideMark/>
+          </w:tcPr>
+          <w:p>
+            <w:pPr>
+              <w:spacing w:after="0" w:line="240" w:lineRule="auto"/>
+              <w:rPr>
+                <w:rFonts w:ascii="Times New Roman" w:eastAsia="Times New Roman" w:hAnsi="Times New Roman" w:cs="Times New Roman"/>
+                <w:b/>
+                <w:bCs/>
+                <w:color w:val="000000"/>
+                <w:sz w:val="24"/>
+                <w:szCs w:val="24"/>
+                <w:lang w:val="en-IN" w:eastAsia="en-IN" w:bidi="mr-IN"/>
+              </w:rPr>
+            </w:pPr>
+            <w:r>
+              <w:rPr>
+                <w:rFonts w:ascii="Times New Roman" w:eastAsia="Times New Roman" w:hAnsi="Times New Roman" w:cs="Times New Roman"/>
+                <w:b/>
+                <w:bCs/>
+                <w:color w:val="000000"/>
+                <w:sz w:val="24"/>
+                <w:szCs w:val="24"/>
+                <w:lang w:val="en-IN" w:eastAsia="en-IN" w:bidi="mr-IN"/>
+              </w:rPr>
+              <w:t>PO4</w:t>
+            </w:r>
+            <w:r>
+              <w:rPr>
+                <w:rFonts w:ascii="Times New Roman" w:eastAsia="Times New Roman" w:hAnsi="Times New Roman" w:cs="Times New Roman"/>
+                <w:color w:val="000000"/>
+                <w:sz w:val="24"/>
+                <w:szCs w:val="24"/>
+                <w:lang w:val="en-IN" w:eastAsia="en-IN" w:bidi="mr-IN"/>
+              </w:rPr>
+              <w:t>:</w:t>
+            </w:r>
+            <w:r>
+              <w:rPr>
+                <w:rFonts w:ascii="Times New Roman" w:eastAsia="Times New Roman" w:hAnsi="Times New Roman" w:cs="Times New Roman"/>
+                <w:b/>
+                <w:bCs/>
+                <w:color w:val="000000"/>
+                <w:sz w:val="24"/>
+                <w:szCs w:val="24"/>
+                <w:lang w:val="en-IN" w:eastAsia="en-IN" w:bidi="mr-IN"/>
+              </w:rPr>
+              <w:t xml:space="preserve"> Engineering Tools, Experimentation and Testing</w:t>
+            </w:r>
+            <w:r>
+              <w:rPr>
+                <w:rFonts w:ascii="Times New Roman" w:eastAsia="Times New Roman" w:hAnsi="Times New Roman" w:cs="Times New Roman"/>
+                <w:color w:val="000000"/>
+                <w:sz w:val="24"/>
+                <w:szCs w:val="24"/>
+                <w:lang w:val="en-IN" w:eastAsia="en-IN" w:bidi="mr-IN"/>
+              </w:rPr>
+              <w:t>: Apply modern engineering tools and appropriate technique to conduct standard tests and measurements.</w:t>
+            </w:r>
+          </w:p>
+        </w:tc>
+      </w:tr>
+      <w:tr>
+        <w:trPr>
+          <w:trHeight w:val="360"/>
+        </w:trPr>
+        <w:tc>
+          <w:tcPr>
+            <w:tcW w:w="684" w:type="pct"/>
+            <w:vMerge w:val="restart"/>
+            <w:tcBorders>
+              <w:top w:val="single" w:sz="4" w:space="0" w:color="auto"/>
+              <w:left w:val="single" w:sz="4" w:space="0" w:color="auto"/>
+              <w:bottom w:val="single" w:sz="4" w:space="0" w:color="auto"/>
+              <w:right w:val="single" w:sz="4" w:space="0" w:color="auto"/>
+            </w:tcBorders>
+            <w:shd w:val="clear" w:color="auto" w:fill="auto"/>
+            <w:vAlign w:val="center"/>
+            <w:hideMark/>
+          </w:tcPr>
+          <w:p>
+            <w:pPr>
+              <w:spacing w:after="0" w:line="240" w:lineRule="auto"/>
+              <w:jc w:val="center"/>
+              <w:rPr>
+                <w:rFonts w:ascii="Times New Roman" w:eastAsia="Times New Roman" w:hAnsi="Times New Roman" w:cs="Times New Roman"/>
+                <w:b/>
+                <w:bCs/>
+                <w:color w:val="000000"/>
+                <w:sz w:val="24"/>
+                <w:szCs w:val="24"/>
+                <w:lang w:val="en-IN" w:eastAsia="en-IN" w:bidi="mr-IN"/>
+              </w:rPr>
+            </w:pPr>
+            <w:r>
+              <w:rPr>
+                <w:rFonts w:ascii="Times New Roman" w:eastAsia="Times New Roman" w:hAnsi="Times New Roman" w:cs="Times New Roman"/>
+                <w:b/>
+                <w:bCs/>
+                <w:color w:val="000000"/>
+                <w:sz w:val="24"/>
+                <w:szCs w:val="24"/>
+                <w:lang w:val="en-IN" w:eastAsia="en-IN" w:bidi="mr-IN"/>
+              </w:rPr>
+              <w:t>PO4</w:t>
+            </w:r>
+          </w:p>
+        </w:tc>
+        <w:tc>
+          <w:tcPr>
+            <w:tcW w:w="884" w:type="pct"/>
+            <w:vMerge w:val="restart"/>
+            <w:tcBorders>
+              <w:top w:val="single" w:sz="4" w:space="0" w:color="auto"/>
+              <w:left w:val="single" w:sz="4" w:space="0" w:color="auto"/>
+              <w:bottom w:val="single" w:sz="4" w:space="0" w:color="auto"/>
+              <w:right w:val="single" w:sz="4" w:space="0" w:color="auto"/>
+            </w:tcBorders>
+            <w:shd w:val="clear" w:color="auto" w:fill="auto"/>
+            <w:vAlign w:val="center"/>
+            <w:hideMark/>
+          </w:tcPr>
+          <w:p>
+            <w:pPr>
+              <w:spacing w:after="0" w:line="240" w:lineRule="auto"/>
+              <w:jc w:val="center"/>
+              <w:rPr>
+                <w:rFonts w:ascii="Times New Roman" w:eastAsia="Times New Roman" w:hAnsi="Times New Roman" w:cs="Times New Roman"/>
+                <w:color w:val="000000"/>
+                <w:sz w:val="24"/>
+                <w:szCs w:val="24"/>
+                <w:lang w:val="en-IN" w:eastAsia="en-IN" w:bidi="mr-IN"/>
+              </w:rPr>
+            </w:pPr>
+            <w:r>
+              <w:rPr>
+                <w:rFonts w:ascii="Times New Roman" w:eastAsia="Times New Roman" w:hAnsi="Times New Roman" w:cs="Times New Roman"/>
+                <w:color w:val="000000"/>
+                <w:sz w:val="24"/>
+                <w:szCs w:val="24"/>
+                <w:lang w:val="en-IN" w:eastAsia="en-IN" w:bidi="mr-IN"/>
+              </w:rPr>
+              <w:t> </w:t>
+            </w:r>
+          </w:p>
+        </w:tc>
+        <w:tc>
+          <w:tcPr>
+            <w:tcW w:w="1022" w:type="pct"/>
+            <w:vMerge w:val="restart"/>
+            <w:tcBorders>
+              <w:top w:val="single" w:sz="4" w:space="0" w:color="auto"/>
+              <w:left w:val="single" w:sz="4" w:space="0" w:color="auto"/>
+              <w:bottom w:val="single" w:sz="4" w:space="0" w:color="auto"/>
+              <w:right w:val="single" w:sz="4" w:space="0" w:color="auto"/>
+            </w:tcBorders>
+            <w:shd w:val="clear" w:color="auto" w:fill="auto"/>
+            <w:vAlign w:val="center"/>
+            <w:hideMark/>
+          </w:tcPr>
+          <w:p>
+            <w:pPr>
+              <w:spacing w:after="0" w:line="240" w:lineRule="auto"/>
+              <w:jc w:val="center"/>
+              <w:rPr>
+                <w:rFonts w:ascii="Times New Roman" w:eastAsia="Times New Roman" w:hAnsi="Times New Roman" w:cs="Times New Roman"/>
+                <w:color w:val="000000"/>
+                <w:sz w:val="24"/>
+                <w:szCs w:val="24"/>
+                <w:lang w:val="en-IN" w:eastAsia="en-IN" w:bidi="mr-IN"/>
+              </w:rPr>
+            </w:pPr>
+            <w:r>
+              <w:rPr>
+                <w:rFonts w:ascii="Times New Roman" w:eastAsia="Times New Roman" w:hAnsi="Times New Roman" w:cs="Times New Roman"/>
+                <w:color w:val="000000"/>
+                <w:sz w:val="24"/>
+                <w:szCs w:val="24"/>
+                <w:lang w:val="en-IN" w:eastAsia="en-IN" w:bidi="mr-IN"/>
+              </w:rPr>
+              <w:t> </w:t>
+            </w:r>
+          </w:p>
+        </w:tc>
+        <w:tc>
+          <w:tcPr>
+            <w:tcW w:w="2410" w:type="pct"/>
+            <w:tcBorders>
+              <w:top w:val="single" w:sz="4" w:space="0" w:color="auto"/>
+              <w:left w:val="nil"/>
+              <w:bottom w:val="single" w:sz="4" w:space="0" w:color="auto"/>
+              <w:right w:val="single" w:sz="4" w:space="0" w:color="auto"/>
+            </w:tcBorders>
+            <w:shd w:val="clear" w:color="auto" w:fill="auto"/>
+            <w:vAlign w:val="center"/>
+            <w:hideMark/>
+          </w:tcPr>
+          <w:p>
+            <w:pPr>
+              <w:spacing w:after="0" w:line="240" w:lineRule="auto"/>
+              <w:rPr>
+                <w:rFonts w:ascii="Times New Roman" w:eastAsia="Times New Roman" w:hAnsi="Times New Roman" w:cs="Times New Roman"/>
+                <w:color w:val="000000"/>
+                <w:sz w:val="24"/>
+                <w:szCs w:val="24"/>
+                <w:lang w:val="en-IN" w:eastAsia="en-IN" w:bidi="mr-IN"/>
+              </w:rPr>
+            </w:pPr>
+            <w:r>
+              <w:rPr>
+                <w:rFonts w:ascii="Times New Roman" w:eastAsia="Times New Roman" w:hAnsi="Times New Roman" w:cs="Times New Roman"/>
+                <w:color w:val="000000"/>
+                <w:sz w:val="24"/>
+                <w:szCs w:val="24"/>
+                <w:lang w:val="en-IN" w:eastAsia="en-IN" w:bidi="mr-IN"/>
+              </w:rPr>
+              <w:t>1. Less exposure to Industrial training</w:t>
+            </w:r>
+          </w:p>
+        </w:tc>
+      </w:tr>
+      <w:tr>
+        <w:trPr>
+          <w:trHeight w:val="315"/>
+        </w:trPr>
+        <w:tc>
+          <w:tcPr>
+            <w:tcW w:w="684" w:type="pct"/>
+            <w:vMerge/>
+            <w:tcBorders>
+              <w:top w:val="single" w:sz="4" w:space="0" w:color="auto"/>
+              <w:left w:val="single" w:sz="4" w:space="0" w:color="auto"/>
+              <w:bottom w:val="single" w:sz="4" w:space="0" w:color="auto"/>
+              <w:right w:val="single" w:sz="4" w:space="0" w:color="auto"/>
+            </w:tcBorders>
+            <w:shd w:val="clear" w:color="auto" w:fill="auto"/>
+            <w:vAlign w:val="center"/>
+            <w:hideMark/>
+          </w:tcPr>
+          <w:p>
+            <w:pPr>
+              <w:spacing w:after="0" w:line="240" w:lineRule="auto"/>
+              <w:rPr>
+                <w:rFonts w:ascii="Times New Roman" w:eastAsia="Times New Roman" w:hAnsi="Times New Roman" w:cs="Times New Roman"/>
+                <w:b/>
+                <w:bCs/>
+                <w:color w:val="000000"/>
+                <w:sz w:val="24"/>
+                <w:szCs w:val="24"/>
+                <w:lang w:val="en-IN" w:eastAsia="en-IN" w:bidi="mr-IN"/>
+              </w:rPr>
+            </w:pPr>
+          </w:p>
+        </w:tc>
+        <w:tc>
+          <w:tcPr>
+            <w:tcW w:w="884" w:type="pct"/>
+            <w:vMerge/>
+            <w:tcBorders>
+              <w:top w:val="single" w:sz="4" w:space="0" w:color="auto"/>
+              <w:left w:val="single" w:sz="4" w:space="0" w:color="auto"/>
+              <w:bottom w:val="single" w:sz="4" w:space="0" w:color="auto"/>
+              <w:right w:val="single" w:sz="4" w:space="0" w:color="auto"/>
+            </w:tcBorders>
+            <w:shd w:val="clear" w:color="auto" w:fill="auto"/>
+            <w:vAlign w:val="center"/>
+            <w:hideMark/>
+          </w:tcPr>
+          <w:p>
+            <w:pPr>
+              <w:spacing w:after="0" w:line="240" w:lineRule="auto"/>
+              <w:rPr>
+                <w:rFonts w:ascii="Times New Roman" w:eastAsia="Times New Roman" w:hAnsi="Times New Roman" w:cs="Times New Roman"/>
+                <w:color w:val="000000"/>
+                <w:sz w:val="24"/>
+                <w:szCs w:val="24"/>
+                <w:lang w:val="en-IN" w:eastAsia="en-IN" w:bidi="mr-IN"/>
+              </w:rPr>
+            </w:pPr>
+          </w:p>
+        </w:tc>
+        <w:tc>
+          <w:tcPr>
+            <w:tcW w:w="1022" w:type="pct"/>
+            <w:vMerge/>
+            <w:tcBorders>
+              <w:top w:val="single" w:sz="4" w:space="0" w:color="auto"/>
+              <w:left w:val="single" w:sz="4" w:space="0" w:color="auto"/>
+              <w:bottom w:val="single" w:sz="4" w:space="0" w:color="auto"/>
+              <w:right w:val="single" w:sz="4" w:space="0" w:color="auto"/>
+            </w:tcBorders>
+            <w:shd w:val="clear" w:color="auto" w:fill="auto"/>
+            <w:vAlign w:val="center"/>
+            <w:hideMark/>
+          </w:tcPr>
+          <w:p>
+            <w:pPr>
+              <w:spacing w:after="0" w:line="240" w:lineRule="auto"/>
+              <w:rPr>
+                <w:rFonts w:ascii="Times New Roman" w:eastAsia="Times New Roman" w:hAnsi="Times New Roman" w:cs="Times New Roman"/>
+                <w:color w:val="000000"/>
+                <w:sz w:val="24"/>
+                <w:szCs w:val="24"/>
+                <w:lang w:val="en-IN" w:eastAsia="en-IN" w:bidi="mr-IN"/>
+              </w:rPr>
+            </w:pPr>
+          </w:p>
+        </w:tc>
+        <w:tc>
+          <w:tcPr>
+            <w:tcW w:w="2410" w:type="pct"/>
+            <w:tcBorders>
+              <w:top w:val="nil"/>
+              <w:left w:val="nil"/>
+              <w:bottom w:val="single" w:sz="4" w:space="0" w:color="auto"/>
+              <w:right w:val="single" w:sz="4" w:space="0" w:color="auto"/>
+            </w:tcBorders>
+            <w:shd w:val="clear" w:color="auto" w:fill="auto"/>
+            <w:vAlign w:val="center"/>
+            <w:hideMark/>
+          </w:tcPr>
+          <w:p>
+            <w:pPr>
+              <w:spacing w:after="0" w:line="240" w:lineRule="auto"/>
+              <w:rPr>
+                <w:rFonts w:ascii="Times New Roman" w:eastAsia="Times New Roman" w:hAnsi="Times New Roman" w:cs="Times New Roman"/>
+                <w:color w:val="000000"/>
+                <w:sz w:val="24"/>
+                <w:szCs w:val="24"/>
+                <w:lang w:val="en-IN" w:eastAsia="en-IN" w:bidi="mr-IN"/>
+              </w:rPr>
+            </w:pPr>
+            <w:r>
+              <w:rPr>
+                <w:rFonts w:ascii="Times New Roman" w:eastAsia="Times New Roman" w:hAnsi="Times New Roman" w:cs="Times New Roman"/>
+                <w:color w:val="000000"/>
+                <w:sz w:val="24"/>
+                <w:szCs w:val="24"/>
+                <w:lang w:val="en-IN" w:eastAsia="en-IN" w:bidi="mr-IN"/>
+              </w:rPr>
+              <w:t xml:space="preserve">2. </w:t>
+            </w:r>
+            <w:bookmarkStart w:id="0" w:name="_GoBack"/>
+            <w:bookmarkEnd w:id="0"/>
+          </w:p>
+        </w:tc>
+      </w:tr>
+      <w:tr>
+        <w:trPr>
+          <w:trHeight w:val="540"/>
+        </w:trPr>
+        <w:tc>
+          <w:tcPr>
+            <w:tcW w:w="5000" w:type="pct"/>
+            <w:gridSpan w:val="4"/>
+            <w:tcBorders>
+              <w:top w:val="single" w:sz="4" w:space="0" w:color="auto"/>
+              <w:left w:val="single" w:sz="4" w:space="0" w:color="auto"/>
+              <w:bottom w:val="single" w:sz="4" w:space="0" w:color="auto"/>
+              <w:right w:val="single" w:sz="4" w:space="0" w:color="auto"/>
+            </w:tcBorders>
+            <w:shd w:val="clear" w:color="000000" w:fill="F2F2F2"/>
+            <w:vAlign w:val="center"/>
+            <w:hideMark/>
+          </w:tcPr>
+          <w:p>
+            <w:pPr>
+              <w:spacing w:after="0" w:line="240" w:lineRule="auto"/>
+              <w:rPr>
+                <w:rFonts w:ascii="Times New Roman" w:eastAsia="Times New Roman" w:hAnsi="Times New Roman" w:cs="Times New Roman"/>
+                <w:b/>
+                <w:bCs/>
+                <w:color w:val="000000"/>
+                <w:sz w:val="24"/>
+                <w:szCs w:val="24"/>
+                <w:lang w:val="en-IN" w:eastAsia="en-IN" w:bidi="mr-IN"/>
+              </w:rPr>
+            </w:pPr>
+            <w:r>
+              <w:rPr>
+                <w:rFonts w:ascii="Times New Roman" w:eastAsia="Times New Roman" w:hAnsi="Times New Roman" w:cs="Times New Roman"/>
+                <w:b/>
+                <w:bCs/>
+                <w:color w:val="000000"/>
+                <w:sz w:val="24"/>
+                <w:szCs w:val="24"/>
+                <w:lang w:val="en-IN" w:eastAsia="en-IN" w:bidi="mr-IN"/>
+              </w:rPr>
+              <w:t>Action 1:</w:t>
+            </w:r>
+            <w:r>
+              <w:rPr>
+                <w:rFonts w:ascii="Times New Roman" w:eastAsia="Times New Roman" w:hAnsi="Times New Roman" w:cs="Times New Roman"/>
+                <w:color w:val="000000"/>
+                <w:sz w:val="24"/>
+                <w:szCs w:val="24"/>
+                <w:lang w:val="en-IN" w:eastAsia="en-IN" w:bidi="mr-IN"/>
+              </w:rPr>
+              <w:t xml:space="preserve"> Industrial visits and industrial training are arranged.</w:t>
+            </w:r>
+          </w:p>
+        </w:tc>
+      </w:tr>
+      <w:tr>
+        <w:trPr>
+          <w:trHeight w:val="720"/>
+        </w:trPr>
+        <w:tc>
+          <w:tcPr>
+            <w:tcW w:w="5000" w:type="pct"/>
+            <w:gridSpan w:val="4"/>
+            <w:tcBorders>
+              <w:top w:val="single" w:sz="4" w:space="0" w:color="auto"/>
+              <w:left w:val="single" w:sz="4" w:space="0" w:color="auto"/>
+              <w:bottom w:val="single" w:sz="4" w:space="0" w:color="auto"/>
+              <w:right w:val="single" w:sz="4" w:space="0" w:color="auto"/>
+            </w:tcBorders>
+            <w:shd w:val="clear" w:color="000000" w:fill="F2F2F2"/>
+            <w:vAlign w:val="center"/>
+            <w:hideMark/>
+          </w:tcPr>
+          <w:p>
+            <w:pPr>
+              <w:spacing w:after="0" w:line="240" w:lineRule="auto"/>
+              <w:rPr>
+                <w:rFonts w:ascii="Times New Roman" w:eastAsia="Times New Roman" w:hAnsi="Times New Roman" w:cs="Times New Roman"/>
+                <w:b/>
+                <w:bCs/>
+                <w:color w:val="000000"/>
+                <w:sz w:val="24"/>
+                <w:szCs w:val="24"/>
+                <w:lang w:val="en-IN" w:eastAsia="en-IN" w:bidi="mr-IN"/>
+              </w:rPr>
+            </w:pPr>
+            <w:r>
+              <w:rPr>
+                <w:rFonts w:ascii="Times New Roman" w:eastAsia="Times New Roman" w:hAnsi="Times New Roman" w:cs="Times New Roman"/>
+                <w:b/>
+                <w:bCs/>
+                <w:color w:val="000000"/>
+                <w:sz w:val="24"/>
+                <w:szCs w:val="24"/>
+                <w:lang w:val="en-IN" w:eastAsia="en-IN" w:bidi="mr-IN"/>
+              </w:rPr>
+              <w:t>Action 2:</w:t>
+            </w:r>
+            <w:r>
+              <w:rPr>
+                <w:rFonts w:ascii="Times New Roman" w:eastAsia="Times New Roman" w:hAnsi="Times New Roman" w:cs="Times New Roman"/>
+                <w:color w:val="000000"/>
+                <w:sz w:val="24"/>
+                <w:szCs w:val="24"/>
+                <w:lang w:val="en-IN" w:eastAsia="en-IN" w:bidi="mr-IN"/>
+              </w:rPr>
+              <w:t xml:space="preserve"> More practical sessions are arranged and Students are motivated to watch online videos and explore practical concepts.</w:t>
             </w:r>
           </w:p>
         </w:tc>

</xml_diff>